<commit_message>
Agrega evidencia real (capturas) e informe completo de RAID 0 y RAID 1
</commit_message>
<xml_diff>
--- a/Almacenamiento en Windows - RAID/Informe - Almacenamiento en Windows - RAID.docx
+++ b/Almacenamiento en Windows - RAID/Informe - Almacenamiento en Windows - RAID.docx
@@ -8,6 +8,9 @@
         <w:jc w:val="center"/>
       </w:pPr>
       <w:r>
+        <w:rPr>
+          <w:color w:val="000000"/>
+        </w:rPr>
         <w:t>Almacenamiento en Windows - RAID</w:t>
       </w:r>
     </w:p>
@@ -16,6 +19,11 @@
         <w:jc w:val="center"/>
       </w:pPr>
       <w:r>
+        <w:rPr>
+          <w:b/>
+          <w:i w:val="0"/>
+          <w:color w:val="000000"/>
+        </w:rPr>
         <w:t>Práctica de Laboratorio: Configuración de RAID 0 y RAID 1 en Windows Server 2019</w:t>
       </w:r>
     </w:p>
@@ -24,7 +32,24 @@
         <w:jc w:val="center"/>
       </w:pPr>
       <w:r>
+        <w:rPr>
+          <w:b w:val="0"/>
+          <w:i w:val="0"/>
+          <w:color w:val="000000"/>
+        </w:rPr>
         <w:t>Sistemas Operativos - Universidad Icesi</w:t>
+      </w:r>
+    </w:p>
+    <w:p>
+      <w:pPr>
+        <w:jc w:val="center"/>
+      </w:pPr>
+      <w:r>
+        <w:rPr>
+          <w:b w:val="0"/>
+          <w:i w:val="0"/>
+          <w:color w:val="000000"/>
+        </w:rPr>
       </w:r>
     </w:p>
     <w:p>
@@ -32,6 +57,9 @@
         <w:pStyle w:val="Heading1"/>
       </w:pPr>
       <w:r>
+        <w:rPr>
+          <w:color w:val="000000"/>
+        </w:rPr>
         <w:t>Integrantes</w:t>
       </w:r>
     </w:p>
@@ -40,6 +68,9 @@
         <w:pStyle w:val="ListBullet"/>
       </w:pPr>
       <w:r>
+        <w:rPr>
+          <w:color w:val="000000"/>
+        </w:rPr>
         <w:t>Juan Esteban Cuellar - A00402548</w:t>
       </w:r>
     </w:p>
@@ -48,6 +79,9 @@
         <w:pStyle w:val="ListBullet"/>
       </w:pPr>
       <w:r>
+        <w:rPr>
+          <w:color w:val="000000"/>
+        </w:rPr>
         <w:t>Fabio Felipe Murillo Rivas - A00401131</w:t>
       </w:r>
     </w:p>
@@ -56,12 +90,20 @@
         <w:pStyle w:val="Heading1"/>
       </w:pPr>
       <w:r>
+        <w:rPr>
+          <w:color w:val="000000"/>
+        </w:rPr>
         <w:t>Objetivo</w:t>
       </w:r>
     </w:p>
     <w:p>
       <w:r>
-        <w:t>Configurar volúmenes RAID 0 (distribuido) y RAID 1 (reflejado) en Windows Server 2019 usando discos dinámicos, comprendiendo sus diferencias en rendimiento, tolerancia a fallos y uso del almacenamiento.</w:t>
+        <w:rPr>
+          <w:b w:val="0"/>
+          <w:i w:val="0"/>
+          <w:color w:val="000000"/>
+        </w:rPr>
+        <w:t>Configurar volúmenes RAID 0 (distribuido) y RAID 1 (reflejado) en Windows Server 2019 utilizando discos dinámicos, comprendiendo sus diferencias en rendimiento, tolerancia a fallos y uso del almacenamiento. La práctica se realizó sobre una máquina virtual Windows Server 2019 alojada en el sistema de virtualización de la Universidad Icesi (cloudestud), accedida mediante el portal web de oVirt desde la red del campus.</w:t>
       </w:r>
     </w:p>
     <w:p>
@@ -69,12 +111,10 @@
         <w:pStyle w:val="Heading1"/>
       </w:pPr>
       <w:r>
-        <w:t>Qué hay que hacer (pendiente)</w:t>
-      </w:r>
-    </w:p>
-    <w:p>
-      <w:r>
-        <w:t>Este informe es una plantilla vacía. Falta completar cada parte con las capturas de pantalla y, si el profesor lo pide, una breve explicación de lo observado.</w:t>
+        <w:rPr>
+          <w:color w:val="000000"/>
+        </w:rPr>
+        <w:t>Marco teórico</w:t>
       </w:r>
     </w:p>
     <w:p>
@@ -82,55 +122,20 @@
         <w:pStyle w:val="Heading2"/>
       </w:pPr>
       <w:r>
-        <w:t>Parte 1: Verificación de discos</w:t>
+        <w:rPr>
+          <w:color w:val="000000"/>
+        </w:rPr>
+        <w:t>¿Qué es RAID?</w:t>
       </w:r>
     </w:p>
     <w:p>
-      <w:pPr>
-        <w:pStyle w:val="ListBullet"/>
-      </w:pPr>
       <w:r>
-        <w:t>Abrir el Administrador de discos (Windows + R, diskmgmt.msc).</w:t>
-      </w:r>
-    </w:p>
-    <w:p>
-      <w:pPr>
-        <w:pStyle w:val="ListBullet"/>
-      </w:pPr>
-      <w:r>
-        <w:t>Identificar los 4 discos adicionales (Disco 1 a 4), que deben aparecer como Offline.</w:t>
-      </w:r>
-    </w:p>
-    <w:p>
-      <w:pPr>
-        <w:pStyle w:val="ListBullet"/>
-      </w:pPr>
-      <w:r>
-        <w:t>Poner los 4 discos en Online (clic derecho → Online).</w:t>
-      </w:r>
-    </w:p>
-    <w:p>
-      <w:pPr>
-        <w:pStyle w:val="ListBullet"/>
-      </w:pPr>
-      <w:r>
-        <w:t>Inicializar cada disco con tabla de particiones GPT (clic derecho → Inicializar disco).</w:t>
-      </w:r>
-    </w:p>
-    <w:p>
-      <w:pPr>
-        <w:pStyle w:val="ListBullet"/>
-      </w:pPr>
-      <w:r>
-        <w:t>[Captura] Discos en estado Offline, antes de iniciar.</w:t>
-      </w:r>
-    </w:p>
-    <w:p>
-      <w:pPr>
-        <w:pStyle w:val="ListBullet"/>
-      </w:pPr>
-      <w:r>
-        <w:t>[Captura] Discos ya en Online e inicializados en GPT.</w:t>
+        <w:rPr>
+          <w:b w:val="0"/>
+          <w:i w:val="0"/>
+          <w:color w:val="000000"/>
+        </w:rPr>
+        <w:t>RAID (Redundant Array of Independent Disks, o Arreglo Redundante de Discos Independientes) es una técnica que combina varios discos físicos para que el sistema operativo los vea como una sola unidad lógica. Los objetivos principales de RAID son: mejorar el rendimiento mediante el acceso paralelo a varios discos, aumentar la tolerancia a fallos mediante redundancia de datos, y en algunos casos expandir la capacidad total de almacenamiento disponible.</w:t>
       </w:r>
     </w:p>
     <w:p>
@@ -138,79 +143,40 @@
         <w:pStyle w:val="Heading2"/>
       </w:pPr>
       <w:r>
-        <w:t>Parte 2: RAID 0 (volumen distribuido / Striped)</w:t>
+        <w:rPr>
+          <w:color w:val="000000"/>
+        </w:rPr>
+        <w:t>RAID 0 - Volumen distribuido (Striped)</w:t>
       </w:r>
     </w:p>
     <w:p>
-      <w:pPr>
-        <w:pStyle w:val="ListBullet"/>
-      </w:pPr>
       <w:r>
-        <w:t>Seleccionar dos discos (por ejemplo, Disco 1 y Disco 2).</w:t>
+        <w:rPr>
+          <w:b w:val="0"/>
+          <w:i w:val="0"/>
+          <w:color w:val="000000"/>
+        </w:rPr>
+        <w:t>RAID 0 divide los datos en bloques y los distribuye (striping) entre dos o más discos físicos. Por ejemplo, el bloque 1 se escribe en el disco A, el bloque 2 en el disco B, el bloque 3 de nuevo en el disco A, y así sucesivamente. Esto permite que las operaciones de lectura y escritura se realicen en paralelo sobre varios discos a la vez, lo que incrementa notablemente la velocidad.</w:t>
       </w:r>
     </w:p>
     <w:p>
-      <w:pPr>
-        <w:pStyle w:val="ListBullet"/>
-      </w:pPr>
       <w:r>
-        <w:t>Clic derecho en el espacio no asignado → Nuevo volumen distribuido (Striped Volume).</w:t>
+        <w:rPr>
+          <w:b w:val="0"/>
+          <w:i w:val="0"/>
+          <w:color w:val="000000"/>
+        </w:rPr>
+        <w:t>Ventaja principal: máximo rendimiento y aprovechamiento del 100 % de la capacidad de los discos utilizados (la suma de todos ellos).</w:t>
       </w:r>
     </w:p>
     <w:p>
-      <w:pPr>
-        <w:pStyle w:val="ListBullet"/>
-      </w:pPr>
       <w:r>
-        <w:t>Agregar los dos discos, asignar letra de unidad, formatear en NTFS y nombrar RAID0_VOL.</w:t>
-      </w:r>
-    </w:p>
-    <w:p>
-      <w:pPr>
-        <w:pStyle w:val="ListBullet"/>
-      </w:pPr>
-      <w:r>
-        <w:t>Aceptar la conversión de los discos a dinámicos.</w:t>
-      </w:r>
-    </w:p>
-    <w:p>
-      <w:pPr>
-        <w:pStyle w:val="ListBullet"/>
-      </w:pPr>
-      <w:r>
-        <w:t>Verificar que el volumen aparezca en el Explorador de archivos.</w:t>
-      </w:r>
-    </w:p>
-    <w:p>
-      <w:pPr>
-        <w:pStyle w:val="ListBullet"/>
-      </w:pPr>
-      <w:r>
-        <w:t>[Captura] Asistente de creación del volumen distribuido con los discos y datos configurados.</w:t>
-      </w:r>
-    </w:p>
-    <w:p>
-      <w:pPr>
-        <w:pStyle w:val="ListBullet"/>
-      </w:pPr>
-      <w:r>
-        <w:t>[Captura] Aviso de conversión a discos dinámicos.</w:t>
-      </w:r>
-    </w:p>
-    <w:p>
-      <w:pPr>
-        <w:pStyle w:val="ListBullet"/>
-      </w:pPr>
-      <w:r>
-        <w:t>[Captura] Volumen RAID0_VOL creado, en estado Healthy, en el Administrador de discos.</w:t>
-      </w:r>
-    </w:p>
-    <w:p>
-      <w:pPr>
-        <w:pStyle w:val="ListBullet"/>
-      </w:pPr>
-      <w:r>
-        <w:t>[Captura] Unidad del RAID 0 visible en el Explorador de archivos.</w:t>
+        <w:rPr>
+          <w:b w:val="0"/>
+          <w:i w:val="0"/>
+          <w:color w:val="000000"/>
+        </w:rPr>
+        <w:t>Desventaja principal: no ofrece ninguna tolerancia a fallos. Si uno solo de los discos del arreglo falla, se pierde la totalidad de la información del volumen, porque cada archivo está fragmentado entre todos los discos.</w:t>
       </w:r>
     </w:p>
     <w:p>
@@ -218,79 +184,40 @@
         <w:pStyle w:val="Heading2"/>
       </w:pPr>
       <w:r>
-        <w:t>Parte 3: RAID 1 (volumen reflejado / Mirrored)</w:t>
+        <w:rPr>
+          <w:color w:val="000000"/>
+        </w:rPr>
+        <w:t>RAID 1 - Volumen reflejado (Mirrored)</w:t>
       </w:r>
     </w:p>
     <w:p>
-      <w:pPr>
-        <w:pStyle w:val="ListBullet"/>
-      </w:pPr>
       <w:r>
-        <w:t>Seleccionar los dos discos restantes (por ejemplo, Disco 3 y Disco 4).</w:t>
+        <w:rPr>
+          <w:b w:val="0"/>
+          <w:i w:val="0"/>
+          <w:color w:val="000000"/>
+        </w:rPr>
+        <w:t>RAID 1 crea una copia exacta (espejo) de los datos en dos discos físicos distintos. Cada escritura se realiza simultáneamente en ambos discos, de modo que en todo momento existen dos copias idénticas de la información.</w:t>
       </w:r>
     </w:p>
     <w:p>
-      <w:pPr>
-        <w:pStyle w:val="ListBullet"/>
-      </w:pPr>
       <w:r>
-        <w:t>Clic derecho en el espacio no asignado → Nuevo volumen reflejado (Mirrored Volume).</w:t>
+        <w:rPr>
+          <w:b w:val="0"/>
+          <w:i w:val="0"/>
+          <w:color w:val="000000"/>
+        </w:rPr>
+        <w:t>Ventaja principal: alta tolerancia a fallos. Si uno de los dos discos falla, el sistema sigue funcionando con el disco restante sin pérdida de datos, y el disco dañado puede reemplazarse y resincronizarse.</w:t>
       </w:r>
     </w:p>
     <w:p>
-      <w:pPr>
-        <w:pStyle w:val="ListBullet"/>
-      </w:pPr>
       <w:r>
-        <w:t>Agregar el segundo disco, asignar letra de unidad, formatear en NTFS y nombrar RAID1_VOL.</w:t>
-      </w:r>
-    </w:p>
-    <w:p>
-      <w:pPr>
-        <w:pStyle w:val="ListBullet"/>
-      </w:pPr>
-      <w:r>
-        <w:t>Aceptar la conversión a discos dinámicos y esperar la sincronización del espejo.</w:t>
-      </w:r>
-    </w:p>
-    <w:p>
-      <w:pPr>
-        <w:pStyle w:val="ListBullet"/>
-      </w:pPr>
-      <w:r>
-        <w:t>Verificar que el volumen quede en estado Correcto (Reflejado).</w:t>
-      </w:r>
-    </w:p>
-    <w:p>
-      <w:pPr>
-        <w:pStyle w:val="ListBullet"/>
-      </w:pPr>
-      <w:r>
-        <w:t>[Captura] Asistente de creación del volumen reflejado con los discos y datos configurados.</w:t>
-      </w:r>
-    </w:p>
-    <w:p>
-      <w:pPr>
-        <w:pStyle w:val="ListBullet"/>
-      </w:pPr>
-      <w:r>
-        <w:t>[Captura] Volumen sincronizando (Resynching), si se alcanza a capturar.</w:t>
-      </w:r>
-    </w:p>
-    <w:p>
-      <w:pPr>
-        <w:pStyle w:val="ListBullet"/>
-      </w:pPr>
-      <w:r>
-        <w:t>[Captura] Volumen RAID1_VOL en estado Correcto (Reflejado).</w:t>
-      </w:r>
-    </w:p>
-    <w:p>
-      <w:pPr>
-        <w:pStyle w:val="ListBullet"/>
-      </w:pPr>
-      <w:r>
-        <w:t>[Captura] Unidad del RAID 1 visible en el Explorador de archivos.</w:t>
+        <w:rPr>
+          <w:b w:val="0"/>
+          <w:i w:val="0"/>
+          <w:color w:val="000000"/>
+        </w:rPr>
+        <w:t>Desventaja principal: solo se aprovecha el 50 % de la capacidad total instalada, ya que la mitad del espacio se destina a la copia redundante.</w:t>
       </w:r>
     </w:p>
     <w:p>
@@ -298,15 +225,20 @@
         <w:pStyle w:val="Heading2"/>
       </w:pPr>
       <w:r>
-        <w:t>Resultado final</w:t>
+        <w:rPr>
+          <w:color w:val="000000"/>
+        </w:rPr>
+        <w:t>Disco básico vs. disco dinámico</w:t>
       </w:r>
     </w:p>
     <w:p>
-      <w:pPr>
-        <w:pStyle w:val="ListBullet"/>
-      </w:pPr>
       <w:r>
-        <w:t>[Captura] Administrador de discos mostrando ambos volúmenes, RAID0_VOL y RAID1_VOL, ya creados y en buen estado.</w:t>
+        <w:rPr>
+          <w:b w:val="0"/>
+          <w:i w:val="0"/>
+          <w:color w:val="000000"/>
+        </w:rPr>
+        <w:t>Windows maneja dos tipos de discos: básicos y dinámicos. Los discos básicos son el tipo predeterminado, usan particiones primarias y extendidas, y no admiten RAID por software. Los discos dinámicos, en cambio, usan una base de datos interna para administrar el almacenamiento y permiten crear volúmenes avanzados como Simple, Spanned (extendido), Striped (RAID 0), Mirrored (RAID 1) y RAID-5. Por esta razón, al crear un volumen distribuido o reflejado, Windows solicita convertir automáticamente los discos básicos seleccionados en discos dinámicos.</w:t>
       </w:r>
     </w:p>
     <w:p>
@@ -314,12 +246,898 @@
         <w:pStyle w:val="Heading1"/>
       </w:pPr>
       <w:r>
-        <w:t>Conclusión (pendiente de redactar)</w:t>
+        <w:rPr>
+          <w:color w:val="000000"/>
+        </w:rPr>
+        <w:t>Entorno de trabajo</w:t>
       </w:r>
     </w:p>
     <w:p>
       <w:r>
-        <w:t>Resumir qué se logró, la diferencia observada entre RAID 0 y RAID 1 en rendimiento, tolerancia a fallos y capacidad utilizable.</w:t>
+        <w:rPr>
+          <w:b w:val="0"/>
+          <w:i w:val="0"/>
+          <w:color w:val="000000"/>
+        </w:rPr>
+        <w:t>La práctica se desarrolló sobre la máquina virtual "windows" (plantilla 09783_gescobar_W19_InstaladaV2, Windows Server 2019 x64) alojada en el sistema de virtualización oVirt de la Universidad Icesi (cloudestud.icesi.edu.co), a la cual se accedió desde el WiFi público del campus. La máquina contaba con 4 discos adicionales de 5 GB cada uno (Disco 1, Disco 2, Disco 3 y Disco 4), sin particionar y sin sistema operativo, además del disco de sistema (C:).</w:t>
+      </w:r>
+    </w:p>
+    <w:p>
+      <w:pPr>
+        <w:pStyle w:val="Heading1"/>
+      </w:pPr>
+      <w:r>
+        <w:rPr>
+          <w:color w:val="000000"/>
+        </w:rPr>
+        <w:t>Parte 1: Verificación e inicialización de discos</w:t>
+      </w:r>
+    </w:p>
+    <w:p>
+      <w:r>
+        <w:rPr>
+          <w:b w:val="0"/>
+          <w:i w:val="0"/>
+          <w:color w:val="000000"/>
+        </w:rPr>
+        <w:t>Se abrió el Administrador de discos de Windows (diskmgmt.msc) desde el menú Inicio. Al ingresar, los 4 discos adicionales aparecían en estado Offline y sin inicializar, tal como se muestra en la Figura 1.</w:t>
+      </w:r>
+    </w:p>
+    <w:p>
+      <w:pPr>
+        <w:jc w:val="center"/>
+      </w:pPr>
+      <w:r>
+        <w:drawing>
+          <wp:inline xmlns:a="http://schemas.openxmlformats.org/drawingml/2006/main" xmlns:pic="http://schemas.openxmlformats.org/drawingml/2006/picture">
+            <wp:extent cx="5760720" cy="2121195"/>
+            <wp:docPr id="1" name="Picture 1"/>
+            <wp:cNvGraphicFramePr>
+              <a:graphicFrameLocks noChangeAspect="1"/>
+            </wp:cNvGraphicFramePr>
+            <a:graphic>
+              <a:graphicData uri="http://schemas.openxmlformats.org/drawingml/2006/picture">
+                <pic:pic>
+                  <pic:nvPicPr>
+                    <pic:cNvPr id="0" name="01_discos_offline.png"/>
+                    <pic:cNvPicPr/>
+                  </pic:nvPicPr>
+                  <pic:blipFill>
+                    <a:blip r:embed="rId9"/>
+                    <a:stretch>
+                      <a:fillRect/>
+                    </a:stretch>
+                  </pic:blipFill>
+                  <pic:spPr>
+                    <a:xfrm>
+                      <a:off x="0" y="0"/>
+                      <a:ext cx="5760720" cy="2121195"/>
+                    </a:xfrm>
+                    <a:prstGeom prst="rect"/>
+                  </pic:spPr>
+                </pic:pic>
+              </a:graphicData>
+            </a:graphic>
+          </wp:inline>
+        </w:drawing>
+      </w:r>
+    </w:p>
+    <w:p>
+      <w:pPr>
+        <w:jc w:val="center"/>
+      </w:pPr>
+      <w:r>
+        <w:rPr>
+          <w:i/>
+          <w:color w:val="000000"/>
+          <w:sz w:val="20"/>
+        </w:rPr>
+        <w:t>Figura 1. Administrador de discos: los 4 discos adicionales (Disco 1 a 4) aparecen en estado Offline, sin asignar.</w:t>
+      </w:r>
+    </w:p>
+    <w:p>
+      <w:r>
+        <w:rPr>
+          <w:b w:val="0"/>
+          <w:i w:val="0"/>
+          <w:color w:val="000000"/>
+        </w:rPr>
+        <w:t>El primer paso fue colocar cada disco en línea (clic derecho sobre el disco → Online). Una vez en línea, los discos pasaron a estado "Not Initialized", y se procedió a inicializarlos todos simultáneamente mediante la opción "Initialize Disk", seleccionando el esquema de partición GPT (GUID Partition Table), como lo pedía la guía de la práctica (Figura 2).</w:t>
+      </w:r>
+    </w:p>
+    <w:p>
+      <w:pPr>
+        <w:jc w:val="center"/>
+      </w:pPr>
+      <w:r>
+        <w:drawing>
+          <wp:inline xmlns:a="http://schemas.openxmlformats.org/drawingml/2006/main" xmlns:pic="http://schemas.openxmlformats.org/drawingml/2006/picture">
+            <wp:extent cx="4572000" cy="3227294"/>
+            <wp:docPr id="2" name="Picture 2"/>
+            <wp:cNvGraphicFramePr>
+              <a:graphicFrameLocks noChangeAspect="1"/>
+            </wp:cNvGraphicFramePr>
+            <a:graphic>
+              <a:graphicData uri="http://schemas.openxmlformats.org/drawingml/2006/picture">
+                <pic:pic>
+                  <pic:nvPicPr>
+                    <pic:cNvPr id="0" name="02_inicializar_discos_gpt.png"/>
+                    <pic:cNvPicPr/>
+                  </pic:nvPicPr>
+                  <pic:blipFill>
+                    <a:blip r:embed="rId10"/>
+                    <a:stretch>
+                      <a:fillRect/>
+                    </a:stretch>
+                  </pic:blipFill>
+                  <pic:spPr>
+                    <a:xfrm>
+                      <a:off x="0" y="0"/>
+                      <a:ext cx="4572000" cy="3227294"/>
+                    </a:xfrm>
+                    <a:prstGeom prst="rect"/>
+                  </pic:spPr>
+                </pic:pic>
+              </a:graphicData>
+            </a:graphic>
+          </wp:inline>
+        </w:drawing>
+      </w:r>
+    </w:p>
+    <w:p>
+      <w:pPr>
+        <w:jc w:val="center"/>
+      </w:pPr>
+      <w:r>
+        <w:rPr>
+          <w:i/>
+          <w:color w:val="000000"/>
+          <w:sz w:val="20"/>
+        </w:rPr>
+        <w:t>Figura 2. Cuadro de diálogo "Initialize Disk" con los 4 discos seleccionados y el esquema de partición GPT elegido.</w:t>
+      </w:r>
+    </w:p>
+    <w:p>
+      <w:r>
+        <w:rPr>
+          <w:b w:val="0"/>
+          <w:i w:val="0"/>
+          <w:color w:val="000000"/>
+        </w:rPr>
+        <w:t>Tras confirmar la inicialización, los 4 discos quedaron en estado Basic, Online y con su capacidad reconocida (4.99 GB cada uno), listos para la creación de los volúmenes RAID (Figura 3).</w:t>
+      </w:r>
+    </w:p>
+    <w:p>
+      <w:pPr>
+        <w:jc w:val="center"/>
+      </w:pPr>
+      <w:r>
+        <w:drawing>
+          <wp:inline xmlns:a="http://schemas.openxmlformats.org/drawingml/2006/main" xmlns:pic="http://schemas.openxmlformats.org/drawingml/2006/picture">
+            <wp:extent cx="5760720" cy="2121195"/>
+            <wp:docPr id="3" name="Picture 3"/>
+            <wp:cNvGraphicFramePr>
+              <a:graphicFrameLocks noChangeAspect="1"/>
+            </wp:cNvGraphicFramePr>
+            <a:graphic>
+              <a:graphicData uri="http://schemas.openxmlformats.org/drawingml/2006/picture">
+                <pic:pic>
+                  <pic:nvPicPr>
+                    <pic:cNvPr id="0" name="03_discos_online_gpt.png"/>
+                    <pic:cNvPicPr/>
+                  </pic:nvPicPr>
+                  <pic:blipFill>
+                    <a:blip r:embed="rId11"/>
+                    <a:stretch>
+                      <a:fillRect/>
+                    </a:stretch>
+                  </pic:blipFill>
+                  <pic:spPr>
+                    <a:xfrm>
+                      <a:off x="0" y="0"/>
+                      <a:ext cx="5760720" cy="2121195"/>
+                    </a:xfrm>
+                    <a:prstGeom prst="rect"/>
+                  </pic:spPr>
+                </pic:pic>
+              </a:graphicData>
+            </a:graphic>
+          </wp:inline>
+        </w:drawing>
+      </w:r>
+    </w:p>
+    <w:p>
+      <w:pPr>
+        <w:jc w:val="center"/>
+      </w:pPr>
+      <w:r>
+        <w:rPr>
+          <w:i/>
+          <w:color w:val="000000"/>
+          <w:sz w:val="20"/>
+        </w:rPr>
+        <w:t>Figura 3. Los 4 discos ya inicializados: estado Basic, Online, 4.99 GB cada uno.</w:t>
+      </w:r>
+    </w:p>
+    <w:p>
+      <w:pPr>
+        <w:pStyle w:val="Heading1"/>
+      </w:pPr>
+      <w:r>
+        <w:rPr>
+          <w:color w:val="000000"/>
+        </w:rPr>
+        <w:t>Parte 2: Configuración del RAID 0 (volumen distribuido)</w:t>
+      </w:r>
+    </w:p>
+    <w:p>
+      <w:r>
+        <w:rPr>
+          <w:b w:val="0"/>
+          <w:i w:val="0"/>
+          <w:color w:val="000000"/>
+        </w:rPr>
+        <w:t>Para crear el RAID 0 se utilizaron el Disco 1 y el Disco 3. Sobre el espacio no asignado de uno de ellos se seleccionó la opción "New Striped Volume...", y en el asistente se agregaron ambos discos al volumen. El sistema calculó automáticamente el tamaño total del volumen como la suma de ambos discos (10 204 MB), ya que en RAID 0 los datos se reparten entre todos los discos del arreglo.</w:t>
+      </w:r>
+    </w:p>
+    <w:p>
+      <w:r>
+        <w:rPr>
+          <w:b w:val="0"/>
+          <w:i w:val="0"/>
+          <w:color w:val="000000"/>
+        </w:rPr>
+        <w:t>Se asignó la letra de unidad E:, se formateó en NTFS, se activó la opción de formato rápido ("Perform a quick format") y se nombró el volumen como RAID0VOL (sin guion bajo, ya que la consola remota utilizada no permitió escribir ese carácter; el nombre cumple la misma función identificadora que sugería la guía con "RAID0_VOL"). El resumen final del asistente, con todos estos parámetros, se muestra en la Figura 4.</w:t>
+      </w:r>
+    </w:p>
+    <w:p>
+      <w:pPr>
+        <w:jc w:val="center"/>
+      </w:pPr>
+      <w:r>
+        <w:drawing>
+          <wp:inline xmlns:a="http://schemas.openxmlformats.org/drawingml/2006/main" xmlns:pic="http://schemas.openxmlformats.org/drawingml/2006/picture">
+            <wp:extent cx="4572000" cy="2535381"/>
+            <wp:docPr id="4" name="Picture 4"/>
+            <wp:cNvGraphicFramePr>
+              <a:graphicFrameLocks noChangeAspect="1"/>
+            </wp:cNvGraphicFramePr>
+            <a:graphic>
+              <a:graphicData uri="http://schemas.openxmlformats.org/drawingml/2006/picture">
+                <pic:pic>
+                  <pic:nvPicPr>
+                    <pic:cNvPr id="0" name="04_asistente_raid0_resumen.png"/>
+                    <pic:cNvPicPr/>
+                  </pic:nvPicPr>
+                  <pic:blipFill>
+                    <a:blip r:embed="rId12"/>
+                    <a:stretch>
+                      <a:fillRect/>
+                    </a:stretch>
+                  </pic:blipFill>
+                  <pic:spPr>
+                    <a:xfrm>
+                      <a:off x="0" y="0"/>
+                      <a:ext cx="4572000" cy="2535381"/>
+                    </a:xfrm>
+                    <a:prstGeom prst="rect"/>
+                  </pic:spPr>
+                </pic:pic>
+              </a:graphicData>
+            </a:graphic>
+          </wp:inline>
+        </w:drawing>
+      </w:r>
+    </w:p>
+    <w:p>
+      <w:pPr>
+        <w:jc w:val="center"/>
+      </w:pPr>
+      <w:r>
+        <w:rPr>
+          <w:i/>
+          <w:color w:val="000000"/>
+          <w:sz w:val="20"/>
+        </w:rPr>
+        <w:t>Figura 4. Resumen del asistente "New Striped Volume": Disco 1 y Disco 3, 10 204 MB, unidad E:, NTFS, RAID0VOL.</w:t>
+      </w:r>
+    </w:p>
+    <w:p>
+      <w:r>
+        <w:rPr>
+          <w:b w:val="0"/>
+          <w:i w:val="0"/>
+          <w:color w:val="000000"/>
+        </w:rPr>
+        <w:t>Al confirmar, Windows advirtió que los discos seleccionados debían convertirse de discos básicos a discos dinámicos para poder alojar el volumen distribuido, y que una vez convertidos no sería posible iniciar sistemas operativos instalados desde esos discos (lo cual no aplicaba en este caso, ya que estaban vacíos). Se aceptó la conversión (Figura 5).</w:t>
+      </w:r>
+    </w:p>
+    <w:p>
+      <w:pPr>
+        <w:jc w:val="center"/>
+      </w:pPr>
+      <w:r>
+        <w:drawing>
+          <wp:inline xmlns:a="http://schemas.openxmlformats.org/drawingml/2006/main" xmlns:pic="http://schemas.openxmlformats.org/drawingml/2006/picture">
+            <wp:extent cx="5029200" cy="2208770"/>
+            <wp:docPr id="5" name="Picture 5"/>
+            <wp:cNvGraphicFramePr>
+              <a:graphicFrameLocks noChangeAspect="1"/>
+            </wp:cNvGraphicFramePr>
+            <a:graphic>
+              <a:graphicData uri="http://schemas.openxmlformats.org/drawingml/2006/picture">
+                <pic:pic>
+                  <pic:nvPicPr>
+                    <pic:cNvPr id="0" name="05_aviso_conversion_dinamico.png"/>
+                    <pic:cNvPicPr/>
+                  </pic:nvPicPr>
+                  <pic:blipFill>
+                    <a:blip r:embed="rId13"/>
+                    <a:stretch>
+                      <a:fillRect/>
+                    </a:stretch>
+                  </pic:blipFill>
+                  <pic:spPr>
+                    <a:xfrm>
+                      <a:off x="0" y="0"/>
+                      <a:ext cx="5029200" cy="2208770"/>
+                    </a:xfrm>
+                    <a:prstGeom prst="rect"/>
+                  </pic:spPr>
+                </pic:pic>
+              </a:graphicData>
+            </a:graphic>
+          </wp:inline>
+        </w:drawing>
+      </w:r>
+    </w:p>
+    <w:p>
+      <w:pPr>
+        <w:jc w:val="center"/>
+      </w:pPr>
+      <w:r>
+        <w:rPr>
+          <w:i/>
+          <w:color w:val="000000"/>
+          <w:sz w:val="20"/>
+        </w:rPr>
+        <w:t>Figura 5. Aviso de Windows sobre la conversión de los discos básicos a discos dinámicos.</w:t>
+      </w:r>
+    </w:p>
+    <w:p>
+      <w:r>
+        <w:rPr>
+          <w:b w:val="0"/>
+          <w:i w:val="0"/>
+          <w:color w:val="000000"/>
+        </w:rPr>
+        <w:t>Finalizado el proceso, el volumen RAID0VOL (E:) quedó creado correctamente: tipo Striped, disco Dynamic, sistema de archivos NTFS, estado Healthy, con una capacidad de 9.96 GB (resultado de combinar los 4.98 GB de cada uno de los dos discos). Esto confirma que el RAID 0 se configuró exitosamente (Figura 6).</w:t>
+      </w:r>
+    </w:p>
+    <w:p>
+      <w:pPr>
+        <w:jc w:val="center"/>
+      </w:pPr>
+      <w:r>
+        <w:drawing>
+          <wp:inline xmlns:a="http://schemas.openxmlformats.org/drawingml/2006/main" xmlns:pic="http://schemas.openxmlformats.org/drawingml/2006/picture">
+            <wp:extent cx="5760720" cy="530593"/>
+            <wp:docPr id="6" name="Picture 6"/>
+            <wp:cNvGraphicFramePr>
+              <a:graphicFrameLocks noChangeAspect="1"/>
+            </wp:cNvGraphicFramePr>
+            <a:graphic>
+              <a:graphicData uri="http://schemas.openxmlformats.org/drawingml/2006/picture">
+                <pic:pic>
+                  <pic:nvPicPr>
+                    <pic:cNvPr id="0" name="06_raid0_creado.png"/>
+                    <pic:cNvPicPr/>
+                  </pic:nvPicPr>
+                  <pic:blipFill>
+                    <a:blip r:embed="rId14"/>
+                    <a:stretch>
+                      <a:fillRect/>
+                    </a:stretch>
+                  </pic:blipFill>
+                  <pic:spPr>
+                    <a:xfrm>
+                      <a:off x="0" y="0"/>
+                      <a:ext cx="5760720" cy="530593"/>
+                    </a:xfrm>
+                    <a:prstGeom prst="rect"/>
+                  </pic:spPr>
+                </pic:pic>
+              </a:graphicData>
+            </a:graphic>
+          </wp:inline>
+        </w:drawing>
+      </w:r>
+    </w:p>
+    <w:p>
+      <w:pPr>
+        <w:jc w:val="center"/>
+      </w:pPr>
+      <w:r>
+        <w:rPr>
+          <w:i/>
+          <w:color w:val="000000"/>
+          <w:sz w:val="20"/>
+        </w:rPr>
+        <w:t>Figura 6. Administrador de discos mostrando el volumen RAID0VOL (E:), tipo Striped, estado Healthy, 9.96 GB.</w:t>
+      </w:r>
+    </w:p>
+    <w:p>
+      <w:r>
+        <w:rPr>
+          <w:b w:val="0"/>
+          <w:i w:val="0"/>
+          <w:color w:val="000000"/>
+        </w:rPr>
+        <w:t>Explicación: RAID 0 combinó la capacidad de ambos discos (2 x 4.98 GB ≈ 9.96 GB disponibles), ofreciendo mayor velocidad de lectura y escritura gracias al striping, pero sin ninguna tolerancia a fallos: si cualquiera de los dos discos (1 o 3) falla, se pierde toda la información del volumen E:.</w:t>
+      </w:r>
+    </w:p>
+    <w:p>
+      <w:pPr>
+        <w:pStyle w:val="Heading1"/>
+      </w:pPr>
+      <w:r>
+        <w:rPr>
+          <w:color w:val="000000"/>
+        </w:rPr>
+        <w:t>Parte 3: Configuración del RAID 1 (volumen reflejado)</w:t>
+      </w:r>
+    </w:p>
+    <w:p>
+      <w:r>
+        <w:rPr>
+          <w:b w:val="0"/>
+          <w:i w:val="0"/>
+          <w:color w:val="000000"/>
+        </w:rPr>
+        <w:t>Para el RAID 1 se utilizaron los dos discos restantes, Disco 2 y Disco 4. Sobre el espacio no asignado del Disco 4 se seleccionó la opción "New Mirrored Volume...", y en el asistente se agregó el Disco 2 como segundo disco del espejo. A diferencia del RAID 0, el tamaño total del volumen quedó limitado a la capacidad de un solo disco (5102 MB), ya que en un espejo ambos discos almacenan exactamente la misma información.</w:t>
+      </w:r>
+    </w:p>
+    <w:p>
+      <w:r>
+        <w:rPr>
+          <w:b w:val="0"/>
+          <w:i w:val="0"/>
+          <w:color w:val="000000"/>
+        </w:rPr>
+        <w:t>Se asignó la letra de unidad F:, se formateó en NTFS, se activó el formato rápido, y se nombró el volumen como RAID1VOL. El asistente llegó a mostrar el resumen final de la configuración, confirmando todos los parámetros correctos antes de finalizar (Figura 7).</w:t>
+      </w:r>
+    </w:p>
+    <w:p>
+      <w:pPr>
+        <w:jc w:val="center"/>
+      </w:pPr>
+      <w:r>
+        <w:drawing>
+          <wp:inline xmlns:a="http://schemas.openxmlformats.org/drawingml/2006/main" xmlns:pic="http://schemas.openxmlformats.org/drawingml/2006/picture">
+            <wp:extent cx="4572000" cy="2369127"/>
+            <wp:docPr id="7" name="Picture 7"/>
+            <wp:cNvGraphicFramePr>
+              <a:graphicFrameLocks noChangeAspect="1"/>
+            </wp:cNvGraphicFramePr>
+            <a:graphic>
+              <a:graphicData uri="http://schemas.openxmlformats.org/drawingml/2006/picture">
+                <pic:pic>
+                  <pic:nvPicPr>
+                    <pic:cNvPr id="0" name="07_asistente_raid1_resumen.png"/>
+                    <pic:cNvPicPr/>
+                  </pic:nvPicPr>
+                  <pic:blipFill>
+                    <a:blip r:embed="rId15"/>
+                    <a:stretch>
+                      <a:fillRect/>
+                    </a:stretch>
+                  </pic:blipFill>
+                  <pic:spPr>
+                    <a:xfrm>
+                      <a:off x="0" y="0"/>
+                      <a:ext cx="4572000" cy="2369127"/>
+                    </a:xfrm>
+                    <a:prstGeom prst="rect"/>
+                  </pic:spPr>
+                </pic:pic>
+              </a:graphicData>
+            </a:graphic>
+          </wp:inline>
+        </w:drawing>
+      </w:r>
+    </w:p>
+    <w:p>
+      <w:pPr>
+        <w:jc w:val="center"/>
+      </w:pPr>
+      <w:r>
+        <w:rPr>
+          <w:i/>
+          <w:color w:val="000000"/>
+          <w:sz w:val="20"/>
+        </w:rPr>
+        <w:t>Figura 7. Resumen del asistente "New Mirrored Volume": Disco 2 y Disco 4, 5102 MB, unidad F:, NTFS, RAID1VOL.</w:t>
+      </w:r>
+    </w:p>
+    <w:p>
+      <w:r>
+        <w:rPr>
+          <w:b/>
+          <w:i w:val="0"/>
+          <w:color w:val="000000"/>
+        </w:rPr>
+        <w:t>Estado del RAID 1 al cierre de esta entrega</w:t>
+      </w:r>
+    </w:p>
+    <w:p>
+      <w:r>
+        <w:rPr>
+          <w:b w:val="0"/>
+          <w:i w:val="0"/>
+          <w:color w:val="000000"/>
+        </w:rPr>
+        <w:t>En este punto se perdió la conexión a la red del campus de la Universidad Icesi, requisito indispensable para acceder al portal de virtualización (cloudestud.icesi.edu.co), antes de poder pulsar el botón "Finish" del asistente. Por lo tanto, el volumen RAID1VOL quedó completamente configurado y listo en el asistente, pero el proceso de conversión a discos dinámicos, formateo y creación final del volumen reflejado no se alcanzó a ejecutar ni a confirmar sobre la máquina virtual.</w:t>
+      </w:r>
+    </w:p>
+    <w:p>
+      <w:r>
+        <w:rPr>
+          <w:b w:val="0"/>
+          <w:i w:val="0"/>
+          <w:color w:val="000000"/>
+        </w:rPr>
+        <w:t>Queda pendiente, la próxima vez que se tenga acceso a la red de la universidad: volver a abrir la consola de la VM "windows", repetir los pasos del asistente de "New Mirrored Volume" con el Disco 2 y el Disco 4 (los parámetros a usar son los mismos ya documentados en la Figura 7), confirmar la conversión a discos dinámicos, esperar la sincronización del espejo (estado "Resynching") y verificar que el volumen quede en estado "Healthy (Mirrored)". Se recomienda capturar también la vista final del Administrador de discos mostrando ambos volúmenes (RAID0VOL y RAID1VOL) y la unidad F: en el Explorador de archivos, como evidencia complementaria.</w:t>
+      </w:r>
+    </w:p>
+    <w:p>
+      <w:pPr>
+        <w:pStyle w:val="Heading1"/>
+      </w:pPr>
+      <w:r>
+        <w:rPr>
+          <w:color w:val="000000"/>
+        </w:rPr>
+        <w:t>Comparación de resultados</w:t>
+      </w:r>
+    </w:p>
+    <w:tbl>
+      <w:tblPr>
+        <w:tblStyle w:val="LightGrid-Accent1"/>
+        <w:tblW w:type="auto" w:w="0"/>
+        <w:tblLook w:firstColumn="1" w:firstRow="1" w:lastColumn="0" w:lastRow="0" w:noHBand="0" w:noVBand="1" w:val="04A0"/>
+      </w:tblPr>
+      <w:tblGrid>
+        <w:gridCol w:w="2160"/>
+        <w:gridCol w:w="2160"/>
+        <w:gridCol w:w="2160"/>
+        <w:gridCol w:w="2160"/>
+      </w:tblGrid>
+      <w:tr>
+        <w:tc>
+          <w:tcPr>
+            <w:tcW w:type="dxa" w:w="2160"/>
+          </w:tcPr>
+          <w:p>
+            <w:r/>
+            <w:r>
+              <w:rPr>
+                <w:b/>
+                <w:color w:val="000000"/>
+              </w:rPr>
+              <w:t>Característica</w:t>
+            </w:r>
+          </w:p>
+        </w:tc>
+        <w:tc>
+          <w:tcPr>
+            <w:tcW w:type="dxa" w:w="2160"/>
+          </w:tcPr>
+          <w:p>
+            <w:r/>
+            <w:r>
+              <w:rPr>
+                <w:b/>
+                <w:color w:val="000000"/>
+              </w:rPr>
+              <w:t>RAID 0 (E:)</w:t>
+            </w:r>
+          </w:p>
+        </w:tc>
+        <w:tc>
+          <w:tcPr>
+            <w:tcW w:type="dxa" w:w="2160"/>
+          </w:tcPr>
+          <w:p>
+            <w:r/>
+            <w:r>
+              <w:rPr>
+                <w:b/>
+                <w:color w:val="000000"/>
+              </w:rPr>
+              <w:t>RAID 1 (F:)</w:t>
+            </w:r>
+          </w:p>
+        </w:tc>
+        <w:tc>
+          <w:tcPr>
+            <w:tcW w:type="dxa" w:w="2160"/>
+          </w:tcPr>
+          <w:p>
+            <w:r/>
+            <w:r>
+              <w:rPr>
+                <w:b/>
+                <w:color w:val="000000"/>
+              </w:rPr>
+              <w:t>Comentario</w:t>
+            </w:r>
+          </w:p>
+        </w:tc>
+      </w:tr>
+      <w:tr>
+        <w:tc>
+          <w:tcPr>
+            <w:tcW w:type="dxa" w:w="2160"/>
+          </w:tcPr>
+          <w:p>
+            <w:r/>
+            <w:r>
+              <w:rPr>
+                <w:color w:val="000000"/>
+              </w:rPr>
+              <w:t>Discos utilizados</w:t>
+            </w:r>
+          </w:p>
+        </w:tc>
+        <w:tc>
+          <w:tcPr>
+            <w:tcW w:type="dxa" w:w="2160"/>
+          </w:tcPr>
+          <w:p>
+            <w:r/>
+            <w:r>
+              <w:rPr>
+                <w:color w:val="000000"/>
+              </w:rPr>
+              <w:t>Disco 1, Disco 3</w:t>
+            </w:r>
+          </w:p>
+        </w:tc>
+        <w:tc>
+          <w:tcPr>
+            <w:tcW w:type="dxa" w:w="2160"/>
+          </w:tcPr>
+          <w:p>
+            <w:r/>
+            <w:r>
+              <w:rPr>
+                <w:color w:val="000000"/>
+              </w:rPr>
+              <w:t>Disco 2, Disco 4</w:t>
+            </w:r>
+          </w:p>
+        </w:tc>
+        <w:tc>
+          <w:tcPr>
+            <w:tcW w:type="dxa" w:w="2160"/>
+          </w:tcPr>
+          <w:p>
+            <w:r/>
+            <w:r>
+              <w:rPr>
+                <w:color w:val="000000"/>
+              </w:rPr>
+              <w:t>Dos discos de 5 GB en cada arreglo.</w:t>
+            </w:r>
+          </w:p>
+        </w:tc>
+      </w:tr>
+      <w:tr>
+        <w:tc>
+          <w:tcPr>
+            <w:tcW w:type="dxa" w:w="2160"/>
+          </w:tcPr>
+          <w:p>
+            <w:r/>
+            <w:r>
+              <w:rPr>
+                <w:color w:val="000000"/>
+              </w:rPr>
+              <w:t>Capacidad resultante</w:t>
+            </w:r>
+          </w:p>
+        </w:tc>
+        <w:tc>
+          <w:tcPr>
+            <w:tcW w:type="dxa" w:w="2160"/>
+          </w:tcPr>
+          <w:p>
+            <w:r/>
+            <w:r>
+              <w:rPr>
+                <w:color w:val="000000"/>
+              </w:rPr>
+              <w:t>9.96 GB (suma)</w:t>
+            </w:r>
+          </w:p>
+        </w:tc>
+        <w:tc>
+          <w:tcPr>
+            <w:tcW w:type="dxa" w:w="2160"/>
+          </w:tcPr>
+          <w:p>
+            <w:r/>
+            <w:r>
+              <w:rPr>
+                <w:color w:val="000000"/>
+              </w:rPr>
+              <w:t>5102 MB (un disco)</w:t>
+            </w:r>
+          </w:p>
+        </w:tc>
+        <w:tc>
+          <w:tcPr>
+            <w:tcW w:type="dxa" w:w="2160"/>
+          </w:tcPr>
+          <w:p>
+            <w:r/>
+            <w:r>
+              <w:rPr>
+                <w:color w:val="000000"/>
+              </w:rPr>
+              <w:t>RAID 0 suma capacidades; RAID 1 solo usa una.</w:t>
+            </w:r>
+          </w:p>
+        </w:tc>
+      </w:tr>
+      <w:tr>
+        <w:tc>
+          <w:tcPr>
+            <w:tcW w:type="dxa" w:w="2160"/>
+          </w:tcPr>
+          <w:p>
+            <w:r/>
+            <w:r>
+              <w:rPr>
+                <w:color w:val="000000"/>
+              </w:rPr>
+              <w:t>Tolerancia a fallos</w:t>
+            </w:r>
+          </w:p>
+        </w:tc>
+        <w:tc>
+          <w:tcPr>
+            <w:tcW w:type="dxa" w:w="2160"/>
+          </w:tcPr>
+          <w:p>
+            <w:r/>
+            <w:r>
+              <w:rPr>
+                <w:color w:val="000000"/>
+              </w:rPr>
+              <w:t>Ninguna</w:t>
+            </w:r>
+          </w:p>
+        </w:tc>
+        <w:tc>
+          <w:tcPr>
+            <w:tcW w:type="dxa" w:w="2160"/>
+          </w:tcPr>
+          <w:p>
+            <w:r/>
+            <w:r>
+              <w:rPr>
+                <w:color w:val="000000"/>
+              </w:rPr>
+              <w:t>Alta (si se completa)</w:t>
+            </w:r>
+          </w:p>
+        </w:tc>
+        <w:tc>
+          <w:tcPr>
+            <w:tcW w:type="dxa" w:w="2160"/>
+          </w:tcPr>
+          <w:p>
+            <w:r/>
+            <w:r>
+              <w:rPr>
+                <w:color w:val="000000"/>
+              </w:rPr>
+              <w:t>RAID 0 no sobrevive a la falla de un disco.</w:t>
+            </w:r>
+          </w:p>
+        </w:tc>
+      </w:tr>
+      <w:tr>
+        <w:tc>
+          <w:tcPr>
+            <w:tcW w:type="dxa" w:w="2160"/>
+          </w:tcPr>
+          <w:p>
+            <w:r/>
+            <w:r>
+              <w:rPr>
+                <w:color w:val="000000"/>
+              </w:rPr>
+              <w:t>Estado al finalizar</w:t>
+            </w:r>
+          </w:p>
+        </w:tc>
+        <w:tc>
+          <w:tcPr>
+            <w:tcW w:type="dxa" w:w="2160"/>
+          </w:tcPr>
+          <w:p>
+            <w:r/>
+            <w:r>
+              <w:rPr>
+                <w:color w:val="000000"/>
+              </w:rPr>
+              <w:t>Completado (Healthy)</w:t>
+            </w:r>
+          </w:p>
+        </w:tc>
+        <w:tc>
+          <w:tcPr>
+            <w:tcW w:type="dxa" w:w="2160"/>
+          </w:tcPr>
+          <w:p>
+            <w:r/>
+            <w:r>
+              <w:rPr>
+                <w:color w:val="000000"/>
+              </w:rPr>
+              <w:t>Configurado, pendiente de Finish</w:t>
+            </w:r>
+          </w:p>
+        </w:tc>
+        <w:tc>
+          <w:tcPr>
+            <w:tcW w:type="dxa" w:w="2160"/>
+          </w:tcPr>
+          <w:p>
+            <w:r/>
+            <w:r>
+              <w:rPr>
+                <w:color w:val="000000"/>
+              </w:rPr>
+              <w:t>RAID 1 quedó sin ejecutar por pérdida de red.</w:t>
+            </w:r>
+          </w:p>
+        </w:tc>
+      </w:tr>
+    </w:tbl>
+    <w:p/>
+    <w:p>
+      <w:pPr>
+        <w:pStyle w:val="Heading1"/>
+      </w:pPr>
+      <w:r>
+        <w:rPr>
+          <w:color w:val="000000"/>
+        </w:rPr>
+        <w:t>Conclusión</w:t>
+      </w:r>
+    </w:p>
+    <w:p>
+      <w:r>
+        <w:rPr>
+          <w:b w:val="0"/>
+          <w:i w:val="0"/>
+          <w:color w:val="000000"/>
+        </w:rPr>
+        <w:t>Se logró configurar completamente un volumen RAID 0 sobre discos dinámicos en Windows Server 2019, verificando que ofrece mayor capacidad y rendimiento al repartir los datos entre dos discos, a costa de no tener ninguna tolerancia a fallos. La configuración del volumen RAID 1 quedó lista en el asistente, con los parámetros correctos documentados (Disco 2 y Disco 4, unidad F:, NTFS, RAID1VOL), pero su creación final no pudo confirmarse por pérdida de acceso a la red de la universidad, necesaria para administrar la máquina virtual en cloudestud. Esta práctica permitió comprender de forma aplicada la diferencia fundamental entre ambos niveles de RAID: mientras RAID 0 prioriza velocidad y capacidad mediante striping, RAID 1 prioriza la seguridad de los datos mediante mirroring, sacrificando la mitad de la capacidad disponible.</w:t>
+      </w:r>
+    </w:p>
+    <w:p>
+      <w:r>
+        <w:rPr>
+          <w:b w:val="0"/>
+          <w:i/>
+          <w:color w:val="000000"/>
+          <w:sz w:val="18"/>
+        </w:rPr>
+        <w:t>Nota: las figuras 1 a 7 de este informe son capturas de pantalla reales, tomadas directamente durante la ejecución de la práctica sobre la máquina virtual de la universidad. No se incluyen capturas simuladas o recreadas de pasos que no llegaron a ejecutarse.</w:t>
       </w:r>
     </w:p>
     <w:sectPr>
@@ -697,6 +1515,7 @@
     <w:rsid w:val="00FC693F"/>
     <w:rPr>
       <w:rFonts w:ascii="Calibri" w:hAnsi="Calibri"/>
+      <w:color w:val="000000"/>
       <w:sz w:val="22"/>
     </w:rPr>
   </w:style>
@@ -759,10 +1578,10 @@
       <w:outlineLvl w:val="0"/>
     </w:pPr>
     <w:rPr>
-      <w:rFonts w:asciiTheme="majorHAnsi" w:eastAsiaTheme="majorEastAsia" w:hAnsiTheme="majorHAnsi" w:cstheme="majorBidi"/>
+      <w:rFonts w:asciiTheme="majorHAnsi" w:eastAsiaTheme="majorEastAsia" w:hAnsiTheme="majorHAnsi" w:cstheme="majorBidi" w:ascii="Calibri" w:hAnsi="Calibri"/>
       <w:b/>
       <w:bCs/>
-      <w:color w:val="365F91" w:themeColor="accent1" w:themeShade="BF"/>
+      <w:color w:val="000000"/>
       <w:sz w:val="28"/>
       <w:szCs w:val="28"/>
     </w:rPr>
@@ -783,10 +1602,10 @@
       <w:outlineLvl w:val="1"/>
     </w:pPr>
     <w:rPr>
-      <w:rFonts w:asciiTheme="majorHAnsi" w:eastAsiaTheme="majorEastAsia" w:hAnsiTheme="majorHAnsi" w:cstheme="majorBidi"/>
+      <w:rFonts w:asciiTheme="majorHAnsi" w:eastAsiaTheme="majorEastAsia" w:hAnsiTheme="majorHAnsi" w:cstheme="majorBidi" w:ascii="Calibri" w:hAnsi="Calibri"/>
       <w:b/>
       <w:bCs/>
-      <w:color w:val="4F81BD" w:themeColor="accent1"/>
+      <w:color w:val="000000"/>
       <w:sz w:val="26"/>
       <w:szCs w:val="26"/>
     </w:rPr>
@@ -807,10 +1626,10 @@
       <w:outlineLvl w:val="2"/>
     </w:pPr>
     <w:rPr>
-      <w:rFonts w:asciiTheme="majorHAnsi" w:eastAsiaTheme="majorEastAsia" w:hAnsiTheme="majorHAnsi" w:cstheme="majorBidi"/>
+      <w:rFonts w:asciiTheme="majorHAnsi" w:eastAsiaTheme="majorEastAsia" w:hAnsiTheme="majorHAnsi" w:cstheme="majorBidi" w:ascii="Calibri" w:hAnsi="Calibri"/>
       <w:b/>
       <w:bCs/>
-      <w:color w:val="4F81BD" w:themeColor="accent1"/>
+      <w:color w:val="000000"/>
     </w:rPr>
   </w:style>
   <w:style w:type="paragraph" w:styleId="Heading4">
@@ -1048,8 +1867,8 @@
       <w:contextualSpacing/>
     </w:pPr>
     <w:rPr>
-      <w:rFonts w:asciiTheme="majorHAnsi" w:eastAsiaTheme="majorEastAsia" w:hAnsiTheme="majorHAnsi" w:cstheme="majorBidi"/>
-      <w:color w:val="17365D" w:themeColor="text2" w:themeShade="BF"/>
+      <w:rFonts w:asciiTheme="majorHAnsi" w:eastAsiaTheme="majorEastAsia" w:hAnsiTheme="majorHAnsi" w:cstheme="majorBidi" w:ascii="Calibri" w:hAnsi="Calibri"/>
+      <w:color w:val="000000"/>
       <w:spacing w:val="5"/>
       <w:kern w:val="28"/>
       <w:sz w:val="52"/>

</xml_diff>

<commit_message>
Mejora legibilidad de capturas y redacta el informe con tono mas natural
</commit_message>
<xml_diff>
--- a/Almacenamiento en Windows - RAID/Informe - Almacenamiento en Windows - RAID.docx
+++ b/Almacenamiento en Windows - RAID/Informe - Almacenamiento en Windows - RAID.docx
@@ -20,11 +20,11 @@
       </w:pPr>
       <w:r>
         <w:rPr>
-          <w:b/>
-          <w:i w:val="0"/>
+          <w:b w:val="0"/>
+          <w:i/>
           <w:color w:val="000000"/>
         </w:rPr>
-        <w:t>Práctica de Laboratorio: Configuración de RAID 0 y RAID 1 en Windows Server 2019</w:t>
+        <w:t>Práctica de laboratorio: configuración de RAID 0 y RAID 1 en Windows Server 2019</w:t>
       </w:r>
     </w:p>
     <w:p>
@@ -41,9 +41,6 @@
       </w:r>
     </w:p>
     <w:p>
-      <w:pPr>
-        <w:jc w:val="center"/>
-      </w:pPr>
       <w:r>
         <w:rPr>
           <w:b w:val="0"/>
@@ -103,7 +100,7 @@
           <w:i w:val="0"/>
           <w:color w:val="000000"/>
         </w:rPr>
-        <w:t>Configurar volúmenes RAID 0 (distribuido) y RAID 1 (reflejado) en Windows Server 2019 utilizando discos dinámicos, comprendiendo sus diferencias en rendimiento, tolerancia a fallos y uso del almacenamiento. La práctica se realizó sobre una máquina virtual Windows Server 2019 alojada en el sistema de virtualización de la Universidad Icesi (cloudestud), accedida mediante el portal web de oVirt desde la red del campus.</w:t>
+        <w:t>Con esta práctica buscábamos entender, de forma práctica y no solo teórica, cómo se comportan dos de los esquemas RAID más comunes: RAID 0 y RAID 1. La idea era montar ambos sobre discos dinámicos en Windows Server 2019 y quedarnos con una idea clara de qué gana y qué pierde cada uno frente al otro, en vez de simplemente leerlo en una guía.</w:t>
       </w:r>
     </w:p>
     <w:p>
@@ -114,7 +111,17 @@
         <w:rPr>
           <w:color w:val="000000"/>
         </w:rPr>
-        <w:t>Marco teórico</w:t>
+        <w:t>Un poco de contexto: ¿qué es RAID?</w:t>
+      </w:r>
+    </w:p>
+    <w:p>
+      <w:r>
+        <w:rPr>
+          <w:b w:val="0"/>
+          <w:i w:val="0"/>
+          <w:color w:val="000000"/>
+        </w:rPr>
+        <w:t>RAID (Redundant Array of Independent Disks) es, en pocas palabras, una forma de combinar varios discos físicos para que el sistema operativo los vea como una sola unidad. Según cómo se combinen, se puede ganar velocidad, redundancia ante fallas, o una mezcla de las dos cosas. No existe un RAID que sea "mejor" en todo sentido: cada nivel sacrifica algo a cambio de otra cosa, y de eso trataba justamente esta guía.</w:t>
       </w:r>
     </w:p>
     <w:p>
@@ -125,7 +132,7 @@
         <w:rPr>
           <w:color w:val="000000"/>
         </w:rPr>
-        <w:t>¿Qué es RAID?</w:t>
+        <w:t>RAID 0: todo velocidad, nada de respaldo</w:t>
       </w:r>
     </w:p>
     <w:p>
@@ -135,7 +142,7 @@
           <w:i w:val="0"/>
           <w:color w:val="000000"/>
         </w:rPr>
-        <w:t>RAID (Redundant Array of Independent Disks, o Arreglo Redundante de Discos Independientes) es una técnica que combina varios discos físicos para que el sistema operativo los vea como una sola unidad lógica. Los objetivos principales de RAID son: mejorar el rendimiento mediante el acceso paralelo a varios discos, aumentar la tolerancia a fallos mediante redundancia de datos, y en algunos casos expandir la capacidad total de almacenamiento disponible.</w:t>
+        <w:t>En RAID 0 los datos se parten en bloques y esos bloques se van repartiendo entre los discos que forman el volumen (por eso también se le llama volumen distribuido o "striped"). Al leer o escribir, varios discos trabajan al mismo tiempo, lo que se traduce en mejor rendimiento y en aprovechar el 100% de la capacidad de los discos involucrados. El problema es que no hay ninguna copia de seguridad integrada: si uno solo de los discos falla, se pierde toda la información del volumen, no solo la parte que estaba en ese disco.</w:t>
       </w:r>
     </w:p>
     <w:p>
@@ -146,7 +153,7 @@
         <w:rPr>
           <w:color w:val="000000"/>
         </w:rPr>
-        <w:t>RAID 0 - Volumen distribuido (Striped)</w:t>
+        <w:t>RAID 1: todo respaldo, la mitad de la capacidad</w:t>
       </w:r>
     </w:p>
     <w:p>
@@ -156,68 +163,7 @@
           <w:i w:val="0"/>
           <w:color w:val="000000"/>
         </w:rPr>
-        <w:t>RAID 0 divide los datos en bloques y los distribuye (striping) entre dos o más discos físicos. Por ejemplo, el bloque 1 se escribe en el disco A, el bloque 2 en el disco B, el bloque 3 de nuevo en el disco A, y así sucesivamente. Esto permite que las operaciones de lectura y escritura se realicen en paralelo sobre varios discos a la vez, lo que incrementa notablemente la velocidad.</w:t>
-      </w:r>
-    </w:p>
-    <w:p>
-      <w:r>
-        <w:rPr>
-          <w:b w:val="0"/>
-          <w:i w:val="0"/>
-          <w:color w:val="000000"/>
-        </w:rPr>
-        <w:t>Ventaja principal: máximo rendimiento y aprovechamiento del 100 % de la capacidad de los discos utilizados (la suma de todos ellos).</w:t>
-      </w:r>
-    </w:p>
-    <w:p>
-      <w:r>
-        <w:rPr>
-          <w:b w:val="0"/>
-          <w:i w:val="0"/>
-          <w:color w:val="000000"/>
-        </w:rPr>
-        <w:t>Desventaja principal: no ofrece ninguna tolerancia a fallos. Si uno solo de los discos del arreglo falla, se pierde la totalidad de la información del volumen, porque cada archivo está fragmentado entre todos los discos.</w:t>
-      </w:r>
-    </w:p>
-    <w:p>
-      <w:pPr>
-        <w:pStyle w:val="Heading2"/>
-      </w:pPr>
-      <w:r>
-        <w:rPr>
-          <w:color w:val="000000"/>
-        </w:rPr>
-        <w:t>RAID 1 - Volumen reflejado (Mirrored)</w:t>
-      </w:r>
-    </w:p>
-    <w:p>
-      <w:r>
-        <w:rPr>
-          <w:b w:val="0"/>
-          <w:i w:val="0"/>
-          <w:color w:val="000000"/>
-        </w:rPr>
-        <w:t>RAID 1 crea una copia exacta (espejo) de los datos en dos discos físicos distintos. Cada escritura se realiza simultáneamente en ambos discos, de modo que en todo momento existen dos copias idénticas de la información.</w:t>
-      </w:r>
-    </w:p>
-    <w:p>
-      <w:r>
-        <w:rPr>
-          <w:b w:val="0"/>
-          <w:i w:val="0"/>
-          <w:color w:val="000000"/>
-        </w:rPr>
-        <w:t>Ventaja principal: alta tolerancia a fallos. Si uno de los dos discos falla, el sistema sigue funcionando con el disco restante sin pérdida de datos, y el disco dañado puede reemplazarse y resincronizarse.</w:t>
-      </w:r>
-    </w:p>
-    <w:p>
-      <w:r>
-        <w:rPr>
-          <w:b w:val="0"/>
-          <w:i w:val="0"/>
-          <w:color w:val="000000"/>
-        </w:rPr>
-        <w:t>Desventaja principal: solo se aprovecha el 50 % de la capacidad total instalada, ya que la mitad del espacio se destina a la copia redundante.</w:t>
+        <w:t>RAID 1 funciona al revés: en lugar de repartir los datos, los duplica. Todo lo que se escribe en un disco se refleja (de ahí "mirrored") en otro disco idéntico. Si uno de los dos falla, el sistema sigue funcionando con el disco que queda, sin perder nada. La contraparte es que, al tener todo duplicado, solo se puede usar la mitad de la capacidad total que aportan los discos.</w:t>
       </w:r>
     </w:p>
     <w:p>
@@ -238,7 +184,7 @@
           <w:i w:val="0"/>
           <w:color w:val="000000"/>
         </w:rPr>
-        <w:t>Windows maneja dos tipos de discos: básicos y dinámicos. Los discos básicos son el tipo predeterminado, usan particiones primarias y extendidas, y no admiten RAID por software. Los discos dinámicos, en cambio, usan una base de datos interna para administrar el almacenamiento y permiten crear volúmenes avanzados como Simple, Spanned (extendido), Striped (RAID 0), Mirrored (RAID 1) y RAID-5. Por esta razón, al crear un volumen distribuido o reflejado, Windows solicita convertir automáticamente los discos básicos seleccionados en discos dinámicos.</w:t>
+        <w:t>Windows maneja dos tipos de disco: básico, que es el formato tradicional con particiones primarias y extendidas, y dinámico, que permite crear volúmenes que abarcan varios discos físicos a la vez (como los que necesitábamos para RAID 0 y RAID 1). Para poder crear un volumen distribuido o un volumen reflejado, Windows exige convertir primero los discos involucrados de básico a dinámico, algo que el propio asistente ofrece hacer automáticamente apenas se empieza a crear el volumen.</w:t>
       </w:r>
     </w:p>
     <w:p>
@@ -259,7 +205,7 @@
           <w:i w:val="0"/>
           <w:color w:val="000000"/>
         </w:rPr>
-        <w:t>La práctica se desarrolló sobre la máquina virtual "windows" (plantilla 09783_gescobar_W19_InstaladaV2, Windows Server 2019 x64) alojada en el sistema de virtualización oVirt de la Universidad Icesi (cloudestud.icesi.edu.co), a la cual se accedió desde el WiFi público del campus. La máquina contaba con 4 discos adicionales de 5 GB cada uno (Disco 1, Disco 2, Disco 3 y Disco 4), sin particionar y sin sistema operativo, además del disco de sistema (C:).</w:t>
+        <w:t>Todo el ejercicio se hizo sobre una máquina virtual Windows Server 2019 (plantilla 09783_gescobar_W19_InstaladaV2) dentro del portal de virtualización oVirt de la universidad (cloudestud.icesi.edu.co), al que solo se puede entrar estando conectado a la red pública del campus. La VM tenía 4 discos adicionales de 5 GB cada uno, sin usar, que fueron los que se emplearon para armar los dos arreglos: dos discos para el RAID 0 y los otros dos para el RAID 1. Toda la interacción con la máquina se hizo a través de la consola VNC del navegador, lo que en algunos momentos hizo que escribir texto o seleccionar elementos de las listas fuera un poco más lento de lo normal.</w:t>
       </w:r>
     </w:p>
     <w:p>
@@ -270,7 +216,7 @@
         <w:rPr>
           <w:color w:val="000000"/>
         </w:rPr>
-        <w:t>Parte 1: Verificación e inicialización de discos</w:t>
+        <w:t>Parte 1 - Preparar los discos</w:t>
       </w:r>
     </w:p>
     <w:p>
@@ -280,7 +226,7 @@
           <w:i w:val="0"/>
           <w:color w:val="000000"/>
         </w:rPr>
-        <w:t>Se abrió el Administrador de discos de Windows (diskmgmt.msc) desde el menú Inicio. Al ingresar, los 4 discos adicionales aparecían en estado Offline y sin inicializar, tal como se muestra en la Figura 1.</w:t>
+        <w:t>Antes de poder crear cualquier volumen había que dejar los cuatro discos listos. Al abrir el Administrador de discos (diskmgmt.msc) los cuatro aparecían como "Offline", que es el estado normal en el que llegan los discos nuevos que se le agregan a una VM.</w:t>
       </w:r>
     </w:p>
     <w:p>
@@ -328,11 +274,12 @@
       </w:pPr>
       <w:r>
         <w:rPr>
+          <w:b w:val="0"/>
           <w:i/>
           <w:color w:val="000000"/>
           <w:sz w:val="20"/>
         </w:rPr>
-        <w:t>Figura 1. Administrador de discos: los 4 discos adicionales (Disco 1 a 4) aparecen en estado Offline, sin asignar.</w:t>
+        <w:t>Figura 1. Los cuatro discos nuevos (Disco 1 a 4) en estado Offline, antes de tocar nada.</w:t>
       </w:r>
     </w:p>
     <w:p>
@@ -342,7 +289,7 @@
           <w:i w:val="0"/>
           <w:color w:val="000000"/>
         </w:rPr>
-        <w:t>El primer paso fue colocar cada disco en línea (clic derecho sobre el disco → Online). Una vez en línea, los discos pasaron a estado "Not Initialized", y se procedió a inicializarlos todos simultáneamente mediante la opción "Initialize Disk", seleccionando el esquema de partición GPT (GUID Partition Table), como lo pedía la guía de la práctica (Figura 2).</w:t>
+        <w:t>El primer paso fue ponerlos en línea uno por uno (clic derecho sobre cada disco → Conectar / Online). Una vez online, aparecen como "No inicializado", así que el siguiente paso fue inicializarlos con tabla de particiones GPT, que es la recomendada hoy en día frente al viejo esquema MBR.</w:t>
       </w:r>
     </w:p>
     <w:p>
@@ -352,7 +299,7 @@
       <w:r>
         <w:drawing>
           <wp:inline xmlns:a="http://schemas.openxmlformats.org/drawingml/2006/main" xmlns:pic="http://schemas.openxmlformats.org/drawingml/2006/picture">
-            <wp:extent cx="4572000" cy="3227294"/>
+            <wp:extent cx="3108960" cy="2194560"/>
             <wp:docPr id="2" name="Picture 2"/>
             <wp:cNvGraphicFramePr>
               <a:graphicFrameLocks noChangeAspect="1"/>
@@ -373,7 +320,7 @@
                   <pic:spPr>
                     <a:xfrm>
                       <a:off x="0" y="0"/>
-                      <a:ext cx="4572000" cy="3227294"/>
+                      <a:ext cx="3108960" cy="2194560"/>
                     </a:xfrm>
                     <a:prstGeom prst="rect"/>
                   </pic:spPr>
@@ -390,11 +337,12 @@
       </w:pPr>
       <w:r>
         <w:rPr>
+          <w:b w:val="0"/>
           <w:i/>
           <w:color w:val="000000"/>
           <w:sz w:val="20"/>
         </w:rPr>
-        <w:t>Figura 2. Cuadro de diálogo "Initialize Disk" con los 4 discos seleccionados y el esquema de partición GPT elegido.</w:t>
+        <w:t>Figura 2. Cuadro de inicialización de discos, con los cuatro discos marcados y GPT seleccionado.</w:t>
       </w:r>
     </w:p>
     <w:p>
@@ -404,7 +352,7 @@
           <w:i w:val="0"/>
           <w:color w:val="000000"/>
         </w:rPr>
-        <w:t>Tras confirmar la inicialización, los 4 discos quedaron en estado Basic, Online y con su capacidad reconocida (4.99 GB cada uno), listos para la creación de los volúmenes RAID (Figura 3).</w:t>
+        <w:t>Después de inicializarlos, los cuatro discos quedaron como Básico, En línea, con sus ~5 GB de espacio sin asignar, listos para que se pudiera trabajar sobre ellos.</w:t>
       </w:r>
     </w:p>
     <w:p>
@@ -452,11 +400,12 @@
       </w:pPr>
       <w:r>
         <w:rPr>
+          <w:b w:val="0"/>
           <w:i/>
           <w:color w:val="000000"/>
           <w:sz w:val="20"/>
         </w:rPr>
-        <w:t>Figura 3. Los 4 discos ya inicializados: estado Basic, Online, 4.99 GB cada uno.</w:t>
+        <w:t>Figura 3. Los cuatro discos ya en línea e inicializados en GPT, con su espacio disponible.</w:t>
       </w:r>
     </w:p>
     <w:p>
@@ -467,7 +416,7 @@
         <w:rPr>
           <w:color w:val="000000"/>
         </w:rPr>
-        <w:t>Parte 2: Configuración del RAID 0 (volumen distribuido)</w:t>
+        <w:t>Parte 2 - RAID 0 (volumen distribuido)</w:t>
       </w:r>
     </w:p>
     <w:p>
@@ -477,7 +426,7 @@
           <w:i w:val="0"/>
           <w:color w:val="000000"/>
         </w:rPr>
-        <w:t>Para crear el RAID 0 se utilizaron el Disco 1 y el Disco 3. Sobre el espacio no asignado de uno de ellos se seleccionó la opción "New Striped Volume...", y en el asistente se agregaron ambos discos al volumen. El sistema calculó automáticamente el tamaño total del volumen como la suma de ambos discos (10 204 MB), ya que en RAID 0 los datos se reparten entre todos los discos del arreglo.</w:t>
+        <w:t>Para el RAID 0 se usaron el Disco 1 y el Disco 3. Se hizo clic derecho sobre el espacio sin asignar de uno de ellos y se eligió "Nuevo volumen distribuido". El asistente pidió agregar el segundo disco, definir el tamaño a usar en cada uno, asignar una letra de unidad y elegir el sistema de archivos.</w:t>
       </w:r>
     </w:p>
     <w:p>
@@ -487,7 +436,7 @@
           <w:i w:val="0"/>
           <w:color w:val="000000"/>
         </w:rPr>
-        <w:t>Se asignó la letra de unidad E:, se formateó en NTFS, se activó la opción de formato rápido ("Perform a quick format") y se nombró el volumen como RAID0VOL (sin guion bajo, ya que la consola remota utilizada no permitió escribir ese carácter; el nombre cumple la misma función identificadora que sugería la guía con "RAID0_VOL"). El resumen final del asistente, con todos estos parámetros, se muestra en la Figura 4.</w:t>
+        <w:t>Se le asignó la letra E:, formato NTFS y el nombre RAID0VOL (sin guion bajo, porque esa tecla en particular no estaba respondiendo bien dentro de la consola VNC; el nombre cumple la misma función igual).</w:t>
       </w:r>
     </w:p>
     <w:p>
@@ -497,7 +446,7 @@
       <w:r>
         <w:drawing>
           <wp:inline xmlns:a="http://schemas.openxmlformats.org/drawingml/2006/main" xmlns:pic="http://schemas.openxmlformats.org/drawingml/2006/picture">
-            <wp:extent cx="4572000" cy="2535381"/>
+            <wp:extent cx="5760720" cy="3194581"/>
             <wp:docPr id="4" name="Picture 4"/>
             <wp:cNvGraphicFramePr>
               <a:graphicFrameLocks noChangeAspect="1"/>
@@ -518,7 +467,7 @@
                   <pic:spPr>
                     <a:xfrm>
                       <a:off x="0" y="0"/>
-                      <a:ext cx="4572000" cy="2535381"/>
+                      <a:ext cx="5760720" cy="3194581"/>
                     </a:xfrm>
                     <a:prstGeom prst="rect"/>
                   </pic:spPr>
@@ -535,11 +484,12 @@
       </w:pPr>
       <w:r>
         <w:rPr>
+          <w:b w:val="0"/>
           <w:i/>
           <w:color w:val="000000"/>
           <w:sz w:val="20"/>
         </w:rPr>
-        <w:t>Figura 4. Resumen del asistente "New Striped Volume": Disco 1 y Disco 3, 10 204 MB, unidad E:, NTFS, RAID0VOL.</w:t>
+        <w:t>Figura 4. Resumen final del asistente antes de confirmar: Disco 1 y Disco 3, 10204 MB, unidad E:, NTFS, RAID0VOL.</w:t>
       </w:r>
     </w:p>
     <w:p>
@@ -549,7 +499,7 @@
           <w:i w:val="0"/>
           <w:color w:val="000000"/>
         </w:rPr>
-        <w:t>Al confirmar, Windows advirtió que los discos seleccionados debían convertirse de discos básicos a discos dinámicos para poder alojar el volumen distribuido, y que una vez convertidos no sería posible iniciar sistemas operativos instalados desde esos discos (lo cual no aplicaba en este caso, ya que estaban vacíos). Se aceptó la conversión (Figura 5).</w:t>
+        <w:t>Al confirmar, Windows avisa que para crear este tipo de volumen necesita convertir los discos seleccionados de básicos a dinámicos, y pide una confirmación aparte para hacerlo.</w:t>
       </w:r>
     </w:p>
     <w:p>
@@ -559,7 +509,7 @@
       <w:r>
         <w:drawing>
           <wp:inline xmlns:a="http://schemas.openxmlformats.org/drawingml/2006/main" xmlns:pic="http://schemas.openxmlformats.org/drawingml/2006/picture">
-            <wp:extent cx="5029200" cy="2208770"/>
+            <wp:extent cx="5760720" cy="2530046"/>
             <wp:docPr id="5" name="Picture 5"/>
             <wp:cNvGraphicFramePr>
               <a:graphicFrameLocks noChangeAspect="1"/>
@@ -580,7 +530,7 @@
                   <pic:spPr>
                     <a:xfrm>
                       <a:off x="0" y="0"/>
-                      <a:ext cx="5029200" cy="2208770"/>
+                      <a:ext cx="5760720" cy="2530046"/>
                     </a:xfrm>
                     <a:prstGeom prst="rect"/>
                   </pic:spPr>
@@ -597,11 +547,12 @@
       </w:pPr>
       <w:r>
         <w:rPr>
+          <w:b w:val="0"/>
           <w:i/>
           <w:color w:val="000000"/>
           <w:sz w:val="20"/>
         </w:rPr>
-        <w:t>Figura 5. Aviso de Windows sobre la conversión de los discos básicos a discos dinámicos.</w:t>
+        <w:t>Figura 5. Aviso de Windows sobre la conversión de los discos a dinámicos.</w:t>
       </w:r>
     </w:p>
     <w:p>
@@ -611,7 +562,7 @@
           <w:i w:val="0"/>
           <w:color w:val="000000"/>
         </w:rPr>
-        <w:t>Finalizado el proceso, el volumen RAID0VOL (E:) quedó creado correctamente: tipo Striped, disco Dynamic, sistema de archivos NTFS, estado Healthy, con una capacidad de 9.96 GB (resultado de combinar los 4.98 GB de cada uno de los dos discos). Esto confirma que el RAID 0 se configuró exitosamente (Figura 6).</w:t>
+        <w:t>Después de aceptar la conversión y esperar el formateo rápido, el volumen quedó creado y disponible de inmediato: en el Administrador de discos se ve como RAID0VOL, tipo Striped, en estado Healthy (Correcto), con cerca de 9.96 GB disponibles, que es básicamente la suma de los dos discos de 5 GB.</w:t>
       </w:r>
     </w:p>
     <w:p>
@@ -659,21 +610,12 @@
       </w:pPr>
       <w:r>
         <w:rPr>
+          <w:b w:val="0"/>
           <w:i/>
           <w:color w:val="000000"/>
           <w:sz w:val="20"/>
         </w:rPr>
-        <w:t>Figura 6. Administrador de discos mostrando el volumen RAID0VOL (E:), tipo Striped, estado Healthy, 9.96 GB.</w:t>
-      </w:r>
-    </w:p>
-    <w:p>
-      <w:r>
-        <w:rPr>
-          <w:b w:val="0"/>
-          <w:i w:val="0"/>
-          <w:color w:val="000000"/>
-        </w:rPr>
-        <w:t>Explicación: RAID 0 combinó la capacidad de ambos discos (2 x 4.98 GB ≈ 9.96 GB disponibles), ofreciendo mayor velocidad de lectura y escritura gracias al striping, pero sin ninguna tolerancia a fallos: si cualquiera de los dos discos (1 o 3) falla, se pierde toda la información del volumen E:.</w:t>
+        <w:t>Figura 6. Volumen RAID0VOL ya creado: Striped, Dynamic, NTFS, Healthy, 9.96 GB.</w:t>
       </w:r>
     </w:p>
     <w:p>
@@ -684,7 +626,7 @@
         <w:rPr>
           <w:color w:val="000000"/>
         </w:rPr>
-        <w:t>Parte 3: Configuración del RAID 1 (volumen reflejado)</w:t>
+        <w:t>Parte 3 - RAID 1 (volumen reflejado)</w:t>
       </w:r>
     </w:p>
     <w:p>
@@ -694,17 +636,7 @@
           <w:i w:val="0"/>
           <w:color w:val="000000"/>
         </w:rPr>
-        <w:t>Para el RAID 1 se utilizaron los dos discos restantes, Disco 2 y Disco 4. Sobre el espacio no asignado del Disco 4 se seleccionó la opción "New Mirrored Volume...", y en el asistente se agregó el Disco 2 como segundo disco del espejo. A diferencia del RAID 0, el tamaño total del volumen quedó limitado a la capacidad de un solo disco (5102 MB), ya que en un espejo ambos discos almacenan exactamente la misma información.</w:t>
-      </w:r>
-    </w:p>
-    <w:p>
-      <w:r>
-        <w:rPr>
-          <w:b w:val="0"/>
-          <w:i w:val="0"/>
-          <w:color w:val="000000"/>
-        </w:rPr>
-        <w:t>Se asignó la letra de unidad F:, se formateó en NTFS, se activó el formato rápido, y se nombró el volumen como RAID1VOL. El asistente llegó a mostrar el resumen final de la configuración, confirmando todos los parámetros correctos antes de finalizar (Figura 7).</w:t>
+        <w:t>Para el RAID 1 tocaba usar el Disco 2 y el Disco 4. El procedimiento arranca igual que el anterior: clic derecho sobre el espacio sin asignar, pero esta vez eligiendo "Nuevo volumen reflejado", que es la opción que crea un RAID 1 en Windows. Se avanzó por el asistente agregando el Disco 4 como pareja, asignando la unidad F:, formato NTFS y el nombre RAID1VOL.</w:t>
       </w:r>
     </w:p>
     <w:p>
@@ -714,7 +646,7 @@
       <w:r>
         <w:drawing>
           <wp:inline xmlns:a="http://schemas.openxmlformats.org/drawingml/2006/main" xmlns:pic="http://schemas.openxmlformats.org/drawingml/2006/picture">
-            <wp:extent cx="4572000" cy="2369127"/>
+            <wp:extent cx="5760720" cy="2985100"/>
             <wp:docPr id="7" name="Picture 7"/>
             <wp:cNvGraphicFramePr>
               <a:graphicFrameLocks noChangeAspect="1"/>
@@ -735,7 +667,7 @@
                   <pic:spPr>
                     <a:xfrm>
                       <a:off x="0" y="0"/>
-                      <a:ext cx="4572000" cy="2369127"/>
+                      <a:ext cx="5760720" cy="2985100"/>
                     </a:xfrm>
                     <a:prstGeom prst="rect"/>
                   </pic:spPr>
@@ -752,21 +684,12 @@
       </w:pPr>
       <w:r>
         <w:rPr>
+          <w:b w:val="0"/>
           <w:i/>
           <w:color w:val="000000"/>
           <w:sz w:val="20"/>
         </w:rPr>
-        <w:t>Figura 7. Resumen del asistente "New Mirrored Volume": Disco 2 y Disco 4, 5102 MB, unidad F:, NTFS, RAID1VOL.</w:t>
-      </w:r>
-    </w:p>
-    <w:p>
-      <w:r>
-        <w:rPr>
-          <w:b/>
-          <w:i w:val="0"/>
-          <w:color w:val="000000"/>
-        </w:rPr>
-        <w:t>Estado del RAID 1 al cierre de esta entrega</w:t>
+        <w:t>Figura 7. Resumen del asistente de volumen reflejado, ya configurado: Disco 2 y Disco 4, 5102 MB, unidad F:, NTFS, RAID1VOL.</w:t>
       </w:r>
     </w:p>
     <w:p>
@@ -776,7 +699,7 @@
           <w:i w:val="0"/>
           <w:color w:val="000000"/>
         </w:rPr>
-        <w:t>En este punto se perdió la conexión a la red del campus de la Universidad Icesi, requisito indispensable para acceder al portal de virtualización (cloudestud.icesi.edu.co), antes de poder pulsar el botón "Finish" del asistente. Por lo tanto, el volumen RAID1VOL quedó completamente configurado y listo en el asistente, pero el proceso de conversión a discos dinámicos, formateo y creación final del volumen reflejado no se alcanzó a ejecutar ni a confirmar sobre la máquina virtual.</w:t>
+        <w:t>Justo en este punto, antes de darle clic a "Finalizar" en el asistente, se cayó la conexión con la consola de la máquina virtual. Se intentó reconectar varias veces desde el portal de oVirt, pero no fue posible recuperar la sesión, y para cuando se pudo volver a intentar ya no se contaba con acceso a la red pública de la universidad (requisito obligatorio para entrar al portal). Por eso el RAID 1 quedó completamente planeado y configurado, como se ve en la Figura 7, pero el volumen como tal nunca se llegó a crear: falta dar clic en Finalizar, aceptar la conversión a discos dinámicos y esperar a que termine la sincronización entre los dos discos.</w:t>
       </w:r>
     </w:p>
     <w:p>
@@ -786,7 +709,62 @@
           <w:i w:val="0"/>
           <w:color w:val="000000"/>
         </w:rPr>
-        <w:t>Queda pendiente, la próxima vez que se tenga acceso a la red de la universidad: volver a abrir la consola de la VM "windows", repetir los pasos del asistente de "New Mirrored Volume" con el Disco 2 y el Disco 4 (los parámetros a usar son los mismos ya documentados en la Figura 7), confirmar la conversión a discos dinámicos, esperar la sincronización del espejo (estado "Resynching") y verificar que el volumen quede en estado "Healthy (Mirrored)". Se recomienda capturar también la vista final del Administrador de discos mostrando ambos volúmenes (RAID0VOL y RAID1VOL) y la unidad F: en el Explorador de archivos, como evidencia complementaria.</w:t>
+        <w:t>Preferimos dejarlo documentado así, de forma transparente, en lugar de simular un resultado que no llegamos a confirmar en la máquina real. Lo que falta para cerrar esta parte es:</w:t>
+      </w:r>
+    </w:p>
+    <w:p>
+      <w:pPr>
+        <w:pStyle w:val="ListBullet"/>
+      </w:pPr>
+      <w:r>
+        <w:rPr>
+          <w:color w:val="000000"/>
+        </w:rPr>
+        <w:t>Reabrir la consola de la VM "windows" desde el portal de oVirt, conectado a la red pública.</w:t>
+      </w:r>
+    </w:p>
+    <w:p>
+      <w:pPr>
+        <w:pStyle w:val="ListBullet"/>
+      </w:pPr>
+      <w:r>
+        <w:rPr>
+          <w:color w:val="000000"/>
+        </w:rPr>
+        <w:t>Repetir el asistente de volumen reflejado con el Disco 2 y el Disco 4 (los mismos datos ya quedaron definidos: 5102 MB, F:, NTFS, RAID1VOL).</w:t>
+      </w:r>
+    </w:p>
+    <w:p>
+      <w:pPr>
+        <w:pStyle w:val="ListBullet"/>
+      </w:pPr>
+      <w:r>
+        <w:rPr>
+          <w:color w:val="000000"/>
+        </w:rPr>
+        <w:t>Dar clic en Finalizar y aceptar la conversión a discos dinámicos.</w:t>
+      </w:r>
+    </w:p>
+    <w:p>
+      <w:pPr>
+        <w:pStyle w:val="ListBullet"/>
+      </w:pPr>
+      <w:r>
+        <w:rPr>
+          <w:color w:val="000000"/>
+        </w:rPr>
+        <w:t>Esperar a que termine la sincronización (Resynching) hasta que el volumen quede en estado Healthy (Mirrored).</w:t>
+      </w:r>
+    </w:p>
+    <w:p>
+      <w:pPr>
+        <w:pStyle w:val="ListBullet"/>
+      </w:pPr>
+      <w:r>
+        <w:rPr>
+          <w:color w:val="000000"/>
+        </w:rPr>
+        <w:t>Tomar una captura final mostrando RAID1VOL en estado correcto, y otra del Explorador de archivos con la unidad F: visible.</w:t>
       </w:r>
     </w:p>
     <w:p>
@@ -797,13 +775,14 @@
         <w:rPr>
           <w:color w:val="000000"/>
         </w:rPr>
-        <w:t>Comparación de resultados</w:t>
+        <w:t>Comparación entre lo que se logró en cada RAID</w:t>
       </w:r>
     </w:p>
     <w:tbl>
       <w:tblPr>
         <w:tblStyle w:val="LightGrid-Accent1"/>
         <w:tblW w:type="auto" w:w="0"/>
+        <w:jc w:val="center"/>
         <w:tblLook w:firstColumn="1" w:firstRow="1" w:lastColumn="0" w:lastRow="0" w:noHBand="0" w:noVBand="1" w:val="04A0"/>
       </w:tblPr>
       <w:tblGrid>
@@ -885,7 +864,7 @@
               <w:rPr>
                 <w:color w:val="000000"/>
               </w:rPr>
-              <w:t>Discos utilizados</w:t>
+              <w:t>Discos usados</w:t>
             </w:r>
           </w:p>
         </w:tc>
@@ -899,7 +878,7 @@
               <w:rPr>
                 <w:color w:val="000000"/>
               </w:rPr>
-              <w:t>Disco 1, Disco 3</w:t>
+              <w:t>Disco 1 y Disco 3</w:t>
             </w:r>
           </w:p>
         </w:tc>
@@ -913,7 +892,7 @@
               <w:rPr>
                 <w:color w:val="000000"/>
               </w:rPr>
-              <w:t>Disco 2, Disco 4</w:t>
+              <w:t>Disco 2 y Disco 4</w:t>
             </w:r>
           </w:p>
         </w:tc>
@@ -927,7 +906,7 @@
               <w:rPr>
                 <w:color w:val="000000"/>
               </w:rPr>
-              <w:t>Dos discos de 5 GB en cada arreglo.</w:t>
+              <w:t>Cada arreglo usa su propio par de discos de 5 GB.</w:t>
             </w:r>
           </w:p>
         </w:tc>
@@ -957,7 +936,7 @@
               <w:rPr>
                 <w:color w:val="000000"/>
               </w:rPr>
-              <w:t>9.96 GB (suma)</w:t>
+              <w:t>~9.96 GB (suma de los dos)</w:t>
             </w:r>
           </w:p>
         </w:tc>
@@ -971,7 +950,7 @@
               <w:rPr>
                 <w:color w:val="000000"/>
               </w:rPr>
-              <w:t>5102 MB (un disco)</w:t>
+              <w:t>~5 GB útiles (de 10 GB físicos)</w:t>
             </w:r>
           </w:p>
         </w:tc>
@@ -985,7 +964,7 @@
               <w:rPr>
                 <w:color w:val="000000"/>
               </w:rPr>
-              <w:t>RAID 0 suma capacidades; RAID 1 solo usa una.</w:t>
+              <w:t>RAID 0 no duplica nada; RAID 1 sí, por eso se pierde la mitad.</w:t>
             </w:r>
           </w:p>
         </w:tc>
@@ -1029,7 +1008,7 @@
               <w:rPr>
                 <w:color w:val="000000"/>
               </w:rPr>
-              <w:t>Alta (si se completa)</w:t>
+              <w:t>Alta (sobrevive a la falla de un disco)</w:t>
             </w:r>
           </w:p>
         </w:tc>
@@ -1043,7 +1022,7 @@
               <w:rPr>
                 <w:color w:val="000000"/>
               </w:rPr>
-              <w:t>RAID 0 no sobrevive a la falla de un disco.</w:t>
+              <w:t>Es la razón principal para elegir uno u otro.</w:t>
             </w:r>
           </w:p>
         </w:tc>
@@ -1073,7 +1052,7 @@
               <w:rPr>
                 <w:color w:val="000000"/>
               </w:rPr>
-              <w:t>Completado (Healthy)</w:t>
+              <w:t>Completado, Healthy</w:t>
             </w:r>
           </w:p>
         </w:tc>
@@ -1087,7 +1066,7 @@
               <w:rPr>
                 <w:color w:val="000000"/>
               </w:rPr>
-              <w:t>Configurado, pendiente de Finish</w:t>
+              <w:t>Configurado en el asistente, sin finalizar</w:t>
             </w:r>
           </w:p>
         </w:tc>
@@ -1101,13 +1080,70 @@
               <w:rPr>
                 <w:color w:val="000000"/>
               </w:rPr>
-              <w:t>RAID 1 quedó sin ejecutar por pérdida de red.</w:t>
+              <w:t>RAID 1 quedó pendiente por la pérdida de conexión a la red del campus.</w:t>
+            </w:r>
+          </w:p>
+        </w:tc>
+      </w:tr>
+      <w:tr>
+        <w:tc>
+          <w:tcPr>
+            <w:tcW w:type="dxa" w:w="2160"/>
+          </w:tcPr>
+          <w:p>
+            <w:r/>
+            <w:r>
+              <w:rPr>
+                <w:color w:val="000000"/>
+              </w:rPr>
+              <w:t>Evidencia disponible</w:t>
+            </w:r>
+          </w:p>
+        </w:tc>
+        <w:tc>
+          <w:tcPr>
+            <w:tcW w:type="dxa" w:w="2160"/>
+          </w:tcPr>
+          <w:p>
+            <w:r/>
+            <w:r>
+              <w:rPr>
+                <w:color w:val="000000"/>
+              </w:rPr>
+              <w:t>3 capturas del proceso completo</w:t>
+            </w:r>
+          </w:p>
+        </w:tc>
+        <w:tc>
+          <w:tcPr>
+            <w:tcW w:type="dxa" w:w="2160"/>
+          </w:tcPr>
+          <w:p>
+            <w:r/>
+            <w:r>
+              <w:rPr>
+                <w:color w:val="000000"/>
+              </w:rPr>
+              <w:t>1 captura del asistente ya configurado</w:t>
+            </w:r>
+          </w:p>
+        </w:tc>
+        <w:tc>
+          <w:tcPr>
+            <w:tcW w:type="dxa" w:w="2160"/>
+          </w:tcPr>
+          <w:p>
+            <w:r/>
+            <w:r>
+              <w:rPr>
+                <w:color w:val="000000"/>
+              </w:rPr>
+              <w:t>Faltan las capturas posteriores a "Finalizar".</w:t>
             </w:r>
           </w:p>
         </w:tc>
       </w:tr>
     </w:tbl>
-    <w:p/>
     <w:p>
       <w:pPr>
         <w:pStyle w:val="Heading1"/>
@@ -1126,7 +1162,16 @@
           <w:i w:val="0"/>
           <w:color w:val="000000"/>
         </w:rPr>
-        <w:t>Se logró configurar completamente un volumen RAID 0 sobre discos dinámicos en Windows Server 2019, verificando que ofrece mayor capacidad y rendimiento al repartir los datos entre dos discos, a costa de no tener ninguna tolerancia a fallos. La configuración del volumen RAID 1 quedó lista en el asistente, con los parámetros correctos documentados (Disco 2 y Disco 4, unidad F:, NTFS, RAID1VOL), pero su creación final no pudo confirmarse por pérdida de acceso a la red de la universidad, necesaria para administrar la máquina virtual en cloudestud. Esta práctica permitió comprender de forma aplicada la diferencia fundamental entre ambos niveles de RAID: mientras RAID 0 prioriza velocidad y capacidad mediante striping, RAID 1 prioriza la seguridad de los datos mediante mirroring, sacrificando la mitad de la capacidad disponible.</w:t>
+        <w:t>Esta práctica nos dejó mucho más claro, de forma concreta, el contraste entre RAID 0 y RAID 1. El RAID 0 fue sencillo de levantar y el resultado se nota: toda la capacidad disponible y, en teoría, mejor rendimiento, pero sin ningún margen de error si un disco llega a fallar. Con el RAID 1 alcanzamos a dejar todo listo y entendimos bien la lógica detrás (duplicar en vez de repartir), aunque por un problema de conexión ajeno al procedimiento en sí no pudimos confirmar el volumen terminado. En conjunto, el ejercicio deja claro que no hay una opción "correcta" entre los dos: todo depende de si lo que se necesita es velocidad y capacidad, o seguridad ante fallas.</w:t>
+      </w:r>
+    </w:p>
+    <w:p>
+      <w:r>
+        <w:rPr>
+          <w:b w:val="0"/>
+          <w:i w:val="0"/>
+          <w:color w:val="000000"/>
+        </w:rPr>
       </w:r>
     </w:p>
     <w:p>
@@ -1137,7 +1182,7 @@
           <w:color w:val="000000"/>
           <w:sz w:val="18"/>
         </w:rPr>
-        <w:t>Nota: las figuras 1 a 7 de este informe son capturas de pantalla reales, tomadas directamente durante la ejecución de la práctica sobre la máquina virtual de la universidad. No se incluyen capturas simuladas o recreadas de pasos que no llegaron a ejecutarse.</w:t>
+        <w:t>Nota: todas las capturas de este informe (Figuras 1 a 7) corresponden a pantallas reales tomadas durante la ejecución de la práctica sobre la máquina virtual de la universidad. No se incluyen capturas simuladas de pasos que no llegaron a ejecutarse; por eso la Parte 3 se documenta como quedó, sin una captura final de RAID1VOL terminado.</w:t>
       </w:r>
     </w:p>
     <w:sectPr>
@@ -1578,7 +1623,7 @@
       <w:outlineLvl w:val="0"/>
     </w:pPr>
     <w:rPr>
-      <w:rFonts w:asciiTheme="majorHAnsi" w:eastAsiaTheme="majorEastAsia" w:hAnsiTheme="majorHAnsi" w:cstheme="majorBidi" w:ascii="Calibri" w:hAnsi="Calibri"/>
+      <w:rFonts w:asciiTheme="majorHAnsi" w:eastAsiaTheme="majorEastAsia" w:hAnsiTheme="majorHAnsi" w:cstheme="majorBidi"/>
       <w:b/>
       <w:bCs/>
       <w:color w:val="000000"/>
@@ -1602,7 +1647,7 @@
       <w:outlineLvl w:val="1"/>
     </w:pPr>
     <w:rPr>
-      <w:rFonts w:asciiTheme="majorHAnsi" w:eastAsiaTheme="majorEastAsia" w:hAnsiTheme="majorHAnsi" w:cstheme="majorBidi" w:ascii="Calibri" w:hAnsi="Calibri"/>
+      <w:rFonts w:asciiTheme="majorHAnsi" w:eastAsiaTheme="majorEastAsia" w:hAnsiTheme="majorHAnsi" w:cstheme="majorBidi"/>
       <w:b/>
       <w:bCs/>
       <w:color w:val="000000"/>
@@ -1626,7 +1671,7 @@
       <w:outlineLvl w:val="2"/>
     </w:pPr>
     <w:rPr>
-      <w:rFonts w:asciiTheme="majorHAnsi" w:eastAsiaTheme="majorEastAsia" w:hAnsiTheme="majorHAnsi" w:cstheme="majorBidi" w:ascii="Calibri" w:hAnsi="Calibri"/>
+      <w:rFonts w:asciiTheme="majorHAnsi" w:eastAsiaTheme="majorEastAsia" w:hAnsiTheme="majorHAnsi" w:cstheme="majorBidi"/>
       <w:b/>
       <w:bCs/>
       <w:color w:val="000000"/>
@@ -1867,7 +1912,6 @@
       <w:contextualSpacing/>
     </w:pPr>
     <w:rPr>
-      <w:rFonts w:asciiTheme="majorHAnsi" w:eastAsiaTheme="majorEastAsia" w:hAnsiTheme="majorHAnsi" w:cstheme="majorBidi" w:ascii="Calibri" w:hAnsi="Calibri"/>
       <w:color w:val="000000"/>
       <w:spacing w:val="5"/>
       <w:kern w:val="28"/>

</xml_diff>

<commit_message>
Aclara en el informe el problema con la maquina virtual y la cuenta universitaria
</commit_message>
<xml_diff>
--- a/Almacenamiento en Windows - RAID/Informe - Almacenamiento en Windows - RAID.docx
+++ b/Almacenamiento en Windows - RAID/Informe - Almacenamiento en Windows - RAID.docx
@@ -699,7 +699,7 @@
           <w:i w:val="0"/>
           <w:color w:val="000000"/>
         </w:rPr>
-        <w:t>Justo en este punto, antes de darle clic a "Finalizar" en el asistente, se cayó la conexión con la consola de la máquina virtual. Se intentó reconectar varias veces desde el portal de oVirt, pero no fue posible recuperar la sesión, y para cuando se pudo volver a intentar ya no se contaba con acceso a la red pública de la universidad (requisito obligatorio para entrar al portal). Por eso el RAID 1 quedó completamente planeado y configurado, como se ve en la Figura 7, pero el volumen como tal nunca se llegó a crear: falta dar clic en Finalizar, aceptar la conversión a discos dinámicos y esperar a que termine la sincronización entre los dos discos.</w:t>
+        <w:t>Justo en este punto, antes de darle clic a "Finalizar" en el asistente, se cayó la conexión con la consola de la máquina virtual. Al intentar reconectar desde el portal de oVirt empezaron los problemas: la máquina virtual quedó inestable y no volvía a responder bien, y al mismo tiempo se presentaron inconvenientes con la cuenta de la universidad para volver a autenticarse en el portal. Entre las dos cosas no fue posible recuperar la sesión, y para cuando se pudo volver a intentar ya tampoco se contaba con acceso a la red pública de la universidad (requisito obligatorio para entrar al portal). Por eso el RAID 1 quedó completamente planeado y configurado, como se ve en la Figura 7, pero el volumen como tal nunca se llegó a crear: falta dar clic en Finalizar, aceptar la conversión a discos dinámicos y esperar a que termine la sincronización entre los dos discos.</w:t>
       </w:r>
     </w:p>
     <w:p>
@@ -1080,7 +1080,7 @@
               <w:rPr>
                 <w:color w:val="000000"/>
               </w:rPr>
-              <w:t>RAID 1 quedó pendiente por la pérdida de conexión a la red del campus.</w:t>
+              <w:t>RAID 1 quedó pendiente por problemas con la máquina virtual y con la cuenta de la universidad al reconectar.</w:t>
             </w:r>
           </w:p>
         </w:tc>

</xml_diff>